<commit_message>
feat: migrate generate_diagrams.py to 100% offline Pillow drawing and upgrade convert_md_to_docx.py table parsing and corporate styles
</commit_message>
<xml_diff>
--- a/HOSO_KY_THUAT_DU_AN.docx
+++ b/HOSO_KY_THUAT_DU_AN.docx
@@ -7,13 +7,13 @@
         <w:keepNext/>
         <w:spacing w:before="360" w:after="160"/>
         <w:pBdr>
-          <w:bottom w:val="single" w:sz="6" w:space="1" w:color="4F81BD"/>
+          <w:bottom w:val="single" w:sz="6" w:space="1" w:color="2C5282"/>
         </w:pBdr>
       </w:pPr>
       <w:r>
         <w:rPr>
           <w:b/>
-          <w:color w:val="1F4E79"/>
+          <w:color w:val="2C5282"/>
           <w:sz w:val="36"/>
         </w:rPr>
         <w:t>HỒ SƠ KỸ THUẬT CHI TIẾT &amp; CHỨNG TỪ QUY TRÌNH SẢN XUẤT PHẦN MỀM</w:t>
@@ -27,7 +27,7 @@
       <w:r>
         <w:rPr>
           <w:b/>
-          <w:color w:val="1F4E79"/>
+          <w:color w:val="2D3748"/>
           <w:sz w:val="28"/>
         </w:rPr>
         <w:t>DỰ ÁN: HỆ THỐNG GIÁM SÁT AN NINH VÀ PHÂN TÍCH NHIỆT ĐỘ CẢNH BÁO SỰ CỐ TẠI THIẾT BỊ BIÊN (SMART CAMERA EDGE SYSTEM)</w:t>
@@ -36,6 +36,7 @@
     <w:p>
       <w:pPr>
         <w:spacing w:after="120" w:before="0" w:line="276" w:lineRule="auto"/>
+        <w:jc w:val="both"/>
       </w:pPr>
       <w:r>
         <w:rPr>
@@ -47,6 +48,7 @@
     <w:p>
       <w:pPr>
         <w:spacing w:after="120" w:before="0" w:line="276" w:lineRule="auto"/>
+        <w:jc w:val="both"/>
       </w:pPr>
       <w:r>
         <w:rPr>
@@ -58,6 +60,7 @@
     <w:p>
       <w:pPr>
         <w:spacing w:after="120" w:before="0" w:line="276" w:lineRule="auto"/>
+        <w:jc w:val="both"/>
       </w:pPr>
       <w:r>
         <w:rPr>
@@ -70,7 +73,7 @@
       <w:pPr>
         <w:spacing w:before="240" w:after="240"/>
         <w:pBdr>
-          <w:bottom w:val="single" w:sz="6" w:space="1" w:color="4F81BD"/>
+          <w:bottom w:val="single" w:sz="6" w:space="1" w:color="2C5282"/>
         </w:pBdr>
       </w:pPr>
     </w:p>
@@ -82,7 +85,7 @@
       <w:r>
         <w:rPr>
           <w:b/>
-          <w:color w:val="1F4E79"/>
+          <w:color w:val="2D3748"/>
           <w:sz w:val="28"/>
         </w:rPr>
         <w:t>MỤC LỤC</w:t>
@@ -91,7 +94,7 @@
     <w:p>
       <w:pPr>
         <w:pStyle w:val="ListNumber"/>
-        <w:spacing w:after="60" w:before="0"/>
+        <w:spacing w:after="60" w:before="0" w:line="276" w:lineRule="auto"/>
         <w:ind w:left="360"/>
       </w:pPr>
       <w:r>
@@ -101,7 +104,7 @@
     <w:p>
       <w:pPr>
         <w:pStyle w:val="ListBullet"/>
-        <w:spacing w:after="60" w:before="0"/>
+        <w:spacing w:after="60" w:before="0" w:line="276" w:lineRule="auto"/>
         <w:ind w:left="360"/>
       </w:pPr>
       <w:r>
@@ -111,7 +114,7 @@
     <w:p>
       <w:pPr>
         <w:pStyle w:val="ListBullet"/>
-        <w:spacing w:after="60" w:before="0"/>
+        <w:spacing w:after="60" w:before="0" w:line="276" w:lineRule="auto"/>
         <w:ind w:left="360"/>
       </w:pPr>
       <w:r>
@@ -121,7 +124,7 @@
     <w:p>
       <w:pPr>
         <w:pStyle w:val="ListBullet"/>
-        <w:spacing w:after="60" w:before="0"/>
+        <w:spacing w:after="60" w:before="0" w:line="276" w:lineRule="auto"/>
         <w:ind w:left="360"/>
       </w:pPr>
       <w:r>
@@ -131,7 +134,7 @@
     <w:p>
       <w:pPr>
         <w:pStyle w:val="ListNumber"/>
-        <w:spacing w:after="60" w:before="0"/>
+        <w:spacing w:after="60" w:before="0" w:line="276" w:lineRule="auto"/>
         <w:ind w:left="360"/>
       </w:pPr>
       <w:r>
@@ -141,7 +144,7 @@
     <w:p>
       <w:pPr>
         <w:pStyle w:val="ListBullet"/>
-        <w:spacing w:after="60" w:before="0"/>
+        <w:spacing w:after="60" w:before="0" w:line="276" w:lineRule="auto"/>
         <w:ind w:left="360"/>
       </w:pPr>
       <w:r>
@@ -151,7 +154,7 @@
     <w:p>
       <w:pPr>
         <w:pStyle w:val="ListBullet"/>
-        <w:spacing w:after="60" w:before="0"/>
+        <w:spacing w:after="60" w:before="0" w:line="276" w:lineRule="auto"/>
         <w:ind w:left="360"/>
       </w:pPr>
       <w:r>
@@ -161,7 +164,7 @@
     <w:p>
       <w:pPr>
         <w:pStyle w:val="ListBullet"/>
-        <w:spacing w:after="60" w:before="0"/>
+        <w:spacing w:after="60" w:before="0" w:line="276" w:lineRule="auto"/>
         <w:ind w:left="360"/>
       </w:pPr>
       <w:r>
@@ -171,7 +174,7 @@
     <w:p>
       <w:pPr>
         <w:pStyle w:val="ListBullet"/>
-        <w:spacing w:after="60" w:before="0"/>
+        <w:spacing w:after="60" w:before="0" w:line="276" w:lineRule="auto"/>
         <w:ind w:left="360"/>
       </w:pPr>
       <w:r>
@@ -181,7 +184,7 @@
     <w:p>
       <w:pPr>
         <w:pStyle w:val="ListNumber"/>
-        <w:spacing w:after="60" w:before="0"/>
+        <w:spacing w:after="60" w:before="0" w:line="276" w:lineRule="auto"/>
         <w:ind w:left="360"/>
       </w:pPr>
       <w:r>
@@ -191,7 +194,7 @@
     <w:p>
       <w:pPr>
         <w:pStyle w:val="ListBullet"/>
-        <w:spacing w:after="60" w:before="0"/>
+        <w:spacing w:after="60" w:before="0" w:line="276" w:lineRule="auto"/>
         <w:ind w:left="360"/>
       </w:pPr>
       <w:r>
@@ -201,7 +204,7 @@
     <w:p>
       <w:pPr>
         <w:pStyle w:val="ListBullet"/>
-        <w:spacing w:after="60" w:before="0"/>
+        <w:spacing w:after="60" w:before="0" w:line="276" w:lineRule="auto"/>
         <w:ind w:left="360"/>
       </w:pPr>
       <w:r>
@@ -211,7 +214,7 @@
     <w:p>
       <w:pPr>
         <w:pStyle w:val="ListNumber"/>
-        <w:spacing w:after="60" w:before="0"/>
+        <w:spacing w:after="60" w:before="0" w:line="276" w:lineRule="auto"/>
         <w:ind w:left="360"/>
       </w:pPr>
       <w:r>
@@ -221,7 +224,7 @@
     <w:p>
       <w:pPr>
         <w:pStyle w:val="ListBullet"/>
-        <w:spacing w:after="60" w:before="0"/>
+        <w:spacing w:after="60" w:before="0" w:line="276" w:lineRule="auto"/>
         <w:ind w:left="360"/>
       </w:pPr>
       <w:r>
@@ -231,7 +234,7 @@
     <w:p>
       <w:pPr>
         <w:pStyle w:val="ListBullet"/>
-        <w:spacing w:after="60" w:before="0"/>
+        <w:spacing w:after="60" w:before="0" w:line="276" w:lineRule="auto"/>
         <w:ind w:left="360"/>
       </w:pPr>
       <w:r>
@@ -241,7 +244,7 @@
     <w:p>
       <w:pPr>
         <w:pStyle w:val="ListBullet"/>
-        <w:spacing w:after="60" w:before="0"/>
+        <w:spacing w:after="60" w:before="0" w:line="276" w:lineRule="auto"/>
         <w:ind w:left="360"/>
       </w:pPr>
       <w:r>
@@ -251,7 +254,7 @@
     <w:p>
       <w:pPr>
         <w:pStyle w:val="ListNumber"/>
-        <w:spacing w:after="60" w:before="0"/>
+        <w:spacing w:after="60" w:before="0" w:line="276" w:lineRule="auto"/>
         <w:ind w:left="360"/>
       </w:pPr>
       <w:r>
@@ -261,7 +264,7 @@
     <w:p>
       <w:pPr>
         <w:pStyle w:val="ListBullet"/>
-        <w:spacing w:after="60" w:before="0"/>
+        <w:spacing w:after="60" w:before="0" w:line="276" w:lineRule="auto"/>
         <w:ind w:left="360"/>
       </w:pPr>
       <w:r>
@@ -271,7 +274,7 @@
     <w:p>
       <w:pPr>
         <w:pStyle w:val="ListBullet"/>
-        <w:spacing w:after="60" w:before="0"/>
+        <w:spacing w:after="60" w:before="0" w:line="276" w:lineRule="auto"/>
         <w:ind w:left="360"/>
       </w:pPr>
       <w:r>
@@ -282,7 +285,7 @@
       <w:pPr>
         <w:spacing w:before="240" w:after="240"/>
         <w:pBdr>
-          <w:bottom w:val="single" w:sz="6" w:space="1" w:color="4F81BD"/>
+          <w:bottom w:val="single" w:sz="6" w:space="1" w:color="2C5282"/>
         </w:pBdr>
       </w:pPr>
     </w:p>
@@ -294,7 +297,7 @@
       <w:r>
         <w:rPr>
           <w:b/>
-          <w:color w:val="1F4E79"/>
+          <w:color w:val="2D3748"/>
           <w:sz w:val="28"/>
         </w:rPr>
         <w:t>I. CÔNG ĐOẠN KHẢO SÁT &amp; XÁC ĐỊNH YÊU CẦU</w:t>
@@ -308,7 +311,7 @@
       <w:r>
         <w:rPr>
           <w:b/>
-          <w:color w:val="595959"/>
+          <w:color w:val="2D3748"/>
           <w:sz w:val="24"/>
         </w:rPr>
         <w:t>1. Phiếu khảo sát yêu cầu khách hàng chi tiết</w:t>
@@ -317,7 +320,7 @@
     <w:p>
       <w:pPr>
         <w:pStyle w:val="ListBullet"/>
-        <w:spacing w:after="60" w:before="0"/>
+        <w:spacing w:after="60" w:before="0" w:line="276" w:lineRule="auto"/>
         <w:ind w:left="360"/>
       </w:pPr>
       <w:r>
@@ -333,7 +336,7 @@
     <w:p>
       <w:pPr>
         <w:pStyle w:val="ListBullet"/>
-        <w:spacing w:after="60" w:before="0"/>
+        <w:spacing w:after="60" w:before="0" w:line="276" w:lineRule="auto"/>
         <w:ind w:left="360"/>
       </w:pPr>
       <w:r>
@@ -349,7 +352,7 @@
     <w:p>
       <w:pPr>
         <w:pStyle w:val="ListBullet"/>
-        <w:spacing w:after="60" w:before="0"/>
+        <w:spacing w:after="60" w:before="0" w:line="276" w:lineRule="auto"/>
         <w:ind w:left="360"/>
       </w:pPr>
       <w:r>
@@ -362,7 +365,7 @@
     <w:p>
       <w:pPr>
         <w:pStyle w:val="ListBullet"/>
-        <w:spacing w:after="60" w:before="0"/>
+        <w:spacing w:after="60" w:before="0" w:line="276" w:lineRule="auto"/>
         <w:ind w:left="720"/>
       </w:pPr>
       <w:r>
@@ -378,7 +381,7 @@
     <w:p>
       <w:pPr>
         <w:pStyle w:val="ListBullet"/>
-        <w:spacing w:after="60" w:before="0"/>
+        <w:spacing w:after="60" w:before="0" w:line="276" w:lineRule="auto"/>
         <w:ind w:left="720"/>
       </w:pPr>
       <w:r>
@@ -394,7 +397,7 @@
     <w:p>
       <w:pPr>
         <w:pStyle w:val="ListBullet"/>
-        <w:spacing w:after="60" w:before="0"/>
+        <w:spacing w:after="60" w:before="0" w:line="276" w:lineRule="auto"/>
         <w:ind w:left="360"/>
       </w:pPr>
       <w:r>
@@ -407,7 +410,7 @@
     <w:p>
       <w:pPr>
         <w:pStyle w:val="ListBullet"/>
-        <w:spacing w:after="60" w:before="0"/>
+        <w:spacing w:after="60" w:before="0" w:line="276" w:lineRule="auto"/>
         <w:ind w:left="720"/>
       </w:pPr>
       <w:r>
@@ -423,7 +426,7 @@
     <w:p>
       <w:pPr>
         <w:pStyle w:val="ListBullet"/>
-        <w:spacing w:after="60" w:before="0"/>
+        <w:spacing w:after="60" w:before="0" w:line="276" w:lineRule="auto"/>
         <w:ind w:left="720"/>
       </w:pPr>
       <w:r>
@@ -439,7 +442,7 @@
     <w:p>
       <w:pPr>
         <w:pStyle w:val="ListBullet"/>
-        <w:spacing w:after="60" w:before="0"/>
+        <w:spacing w:after="60" w:before="0" w:line="276" w:lineRule="auto"/>
         <w:ind w:left="720"/>
       </w:pPr>
       <w:r>
@@ -455,7 +458,7 @@
     <w:p>
       <w:pPr>
         <w:pStyle w:val="ListBullet"/>
-        <w:spacing w:after="60" w:before="0"/>
+        <w:spacing w:after="60" w:before="0" w:line="276" w:lineRule="auto"/>
         <w:ind w:left="720"/>
       </w:pPr>
       <w:r>
@@ -471,7 +474,7 @@
     <w:p>
       <w:pPr>
         <w:pStyle w:val="ListBullet"/>
-        <w:spacing w:after="60" w:before="0"/>
+        <w:spacing w:after="60" w:before="0" w:line="276" w:lineRule="auto"/>
         <w:ind w:left="360"/>
       </w:pPr>
       <w:r>
@@ -484,7 +487,7 @@
     <w:p>
       <w:pPr>
         <w:pStyle w:val="ListBullet"/>
-        <w:spacing w:after="60" w:before="0"/>
+        <w:spacing w:after="60" w:before="0" w:line="276" w:lineRule="auto"/>
         <w:ind w:left="720"/>
       </w:pPr>
       <w:r>
@@ -500,7 +503,7 @@
     <w:p>
       <w:pPr>
         <w:pStyle w:val="ListBullet"/>
-        <w:spacing w:after="60" w:before="0"/>
+        <w:spacing w:after="60" w:before="0" w:line="276" w:lineRule="auto"/>
         <w:ind w:left="720"/>
       </w:pPr>
       <w:r>
@@ -516,7 +519,7 @@
     <w:p>
       <w:pPr>
         <w:pStyle w:val="ListBullet"/>
-        <w:spacing w:after="60" w:before="0"/>
+        <w:spacing w:after="60" w:before="0" w:line="276" w:lineRule="auto"/>
         <w:ind w:left="360"/>
       </w:pPr>
       <w:r>
@@ -529,7 +532,7 @@
     <w:p>
       <w:pPr>
         <w:pStyle w:val="ListNumber"/>
-        <w:spacing w:after="60" w:before="0"/>
+        <w:spacing w:after="60" w:before="0" w:line="276" w:lineRule="auto"/>
         <w:ind w:left="720"/>
       </w:pPr>
       <w:r>
@@ -545,7 +548,7 @@
     <w:p>
       <w:pPr>
         <w:pStyle w:val="ListNumber"/>
-        <w:spacing w:after="60" w:before="0"/>
+        <w:spacing w:after="60" w:before="0" w:line="276" w:lineRule="auto"/>
         <w:ind w:left="720"/>
       </w:pPr>
       <w:r>
@@ -561,7 +564,7 @@
     <w:p>
       <w:pPr>
         <w:pStyle w:val="ListNumber"/>
-        <w:spacing w:after="60" w:before="0"/>
+        <w:spacing w:after="60" w:before="0" w:line="276" w:lineRule="auto"/>
         <w:ind w:left="720"/>
       </w:pPr>
       <w:r>
@@ -577,7 +580,7 @@
     <w:p>
       <w:pPr>
         <w:pStyle w:val="ListNumber"/>
-        <w:spacing w:after="60" w:before="0"/>
+        <w:spacing w:after="60" w:before="0" w:line="276" w:lineRule="auto"/>
         <w:ind w:left="720"/>
       </w:pPr>
       <w:r>
@@ -594,7 +597,7 @@
       <w:pPr>
         <w:spacing w:before="240" w:after="240"/>
         <w:pBdr>
-          <w:bottom w:val="single" w:sz="6" w:space="1" w:color="4F81BD"/>
+          <w:bottom w:val="single" w:sz="6" w:space="1" w:color="2C5282"/>
         </w:pBdr>
       </w:pPr>
     </w:p>
@@ -606,7 +609,7 @@
       <w:r>
         <w:rPr>
           <w:b/>
-          <w:color w:val="595959"/>
+          <w:color w:val="2D3748"/>
           <w:sz w:val="24"/>
         </w:rPr>
         <w:t>2. Tài liệu đặc tả yêu cầu hệ thống (SRS - Software Requirement Specification)</w:t>
@@ -621,7 +624,7 @@
         <w:rPr>
           <w:b/>
           <w:i/>
-          <w:color w:val="595959"/>
+          <w:color w:val="2D3748"/>
           <w:sz w:val="22"/>
         </w:rPr>
         <w:t>A. Yêu cầu tính năng (Functional Requirements)</w:t>
@@ -630,7 +633,7 @@
     <w:p>
       <w:pPr>
         <w:pStyle w:val="ListBullet"/>
-        <w:spacing w:after="60" w:before="0"/>
+        <w:spacing w:after="60" w:before="0" w:line="276" w:lineRule="auto"/>
         <w:ind w:left="360"/>
       </w:pPr>
       <w:r>
@@ -657,7 +660,7 @@
     <w:p>
       <w:pPr>
         <w:pStyle w:val="ListBullet"/>
-        <w:spacing w:after="60" w:before="0"/>
+        <w:spacing w:after="60" w:before="0" w:line="276" w:lineRule="auto"/>
         <w:ind w:left="360"/>
       </w:pPr>
       <w:r>
@@ -670,7 +673,7 @@
     <w:p>
       <w:pPr>
         <w:pStyle w:val="ListBullet"/>
-        <w:spacing w:after="60" w:before="0"/>
+        <w:spacing w:after="60" w:before="0" w:line="276" w:lineRule="auto"/>
         <w:ind w:left="720"/>
       </w:pPr>
       <w:r>
@@ -680,7 +683,7 @@
     <w:p>
       <w:pPr>
         <w:pStyle w:val="ListBullet"/>
-        <w:spacing w:after="60" w:before="0"/>
+        <w:spacing w:after="60" w:before="0" w:line="276" w:lineRule="auto"/>
         <w:ind w:left="720"/>
       </w:pPr>
       <w:r>
@@ -701,7 +704,7 @@
     <w:p>
       <w:pPr>
         <w:pStyle w:val="ListBullet"/>
-        <w:spacing w:after="60" w:before="0"/>
+        <w:spacing w:after="60" w:before="0" w:line="276" w:lineRule="auto"/>
         <w:ind w:left="720"/>
       </w:pPr>
       <w:r>
@@ -711,7 +714,7 @@
     <w:p>
       <w:pPr>
         <w:pStyle w:val="ListBullet"/>
-        <w:spacing w:after="60" w:before="0"/>
+        <w:spacing w:after="60" w:before="0" w:line="276" w:lineRule="auto"/>
         <w:ind w:left="720"/>
       </w:pPr>
       <w:r>
@@ -721,7 +724,7 @@
     <w:p>
       <w:pPr>
         <w:pStyle w:val="ListBullet"/>
-        <w:spacing w:after="60" w:before="0"/>
+        <w:spacing w:after="60" w:before="0" w:line="276" w:lineRule="auto"/>
         <w:ind w:left="360"/>
       </w:pPr>
       <w:r>
@@ -737,7 +740,7 @@
     <w:p>
       <w:pPr>
         <w:pStyle w:val="ListBullet"/>
-        <w:spacing w:after="60" w:before="0"/>
+        <w:spacing w:after="60" w:before="0" w:line="276" w:lineRule="auto"/>
         <w:ind w:left="360"/>
       </w:pPr>
       <w:r>
@@ -775,7 +778,7 @@
     <w:p>
       <w:pPr>
         <w:pStyle w:val="ListBullet"/>
-        <w:spacing w:after="60" w:before="0"/>
+        <w:spacing w:after="60" w:before="0" w:line="276" w:lineRule="auto"/>
         <w:ind w:left="360"/>
       </w:pPr>
       <w:r>
@@ -791,7 +794,7 @@
     <w:p>
       <w:pPr>
         <w:pStyle w:val="ListBullet"/>
-        <w:spacing w:after="60" w:before="0"/>
+        <w:spacing w:after="60" w:before="0" w:line="276" w:lineRule="auto"/>
         <w:ind w:left="360"/>
       </w:pPr>
       <w:r>
@@ -804,7 +807,7 @@
     <w:p>
       <w:pPr>
         <w:pStyle w:val="ListBullet"/>
-        <w:spacing w:after="60" w:before="0"/>
+        <w:spacing w:after="60" w:before="0" w:line="276" w:lineRule="auto"/>
         <w:ind w:left="720"/>
       </w:pPr>
       <w:r>
@@ -814,7 +817,7 @@
     <w:p>
       <w:pPr>
         <w:pStyle w:val="ListBullet"/>
-        <w:spacing w:after="60" w:before="0"/>
+        <w:spacing w:after="60" w:before="0" w:line="276" w:lineRule="auto"/>
         <w:ind w:left="720"/>
       </w:pPr>
       <w:r>
@@ -824,7 +827,7 @@
     <w:p>
       <w:pPr>
         <w:pStyle w:val="ListBullet"/>
-        <w:spacing w:after="60" w:before="0"/>
+        <w:spacing w:after="60" w:before="0" w:line="276" w:lineRule="auto"/>
         <w:ind w:left="720"/>
       </w:pPr>
       <w:r>
@@ -834,7 +837,7 @@
     <w:p>
       <w:pPr>
         <w:pStyle w:val="ListBullet"/>
-        <w:spacing w:after="60" w:before="0"/>
+        <w:spacing w:after="60" w:before="0" w:line="276" w:lineRule="auto"/>
         <w:ind w:left="360"/>
       </w:pPr>
       <w:r>
@@ -872,7 +875,7 @@
     <w:p>
       <w:pPr>
         <w:pStyle w:val="ListBullet"/>
-        <w:spacing w:after="60" w:before="0"/>
+        <w:spacing w:after="60" w:before="0" w:line="276" w:lineRule="auto"/>
         <w:ind w:left="360"/>
       </w:pPr>
       <w:r>
@@ -894,7 +897,7 @@
         <w:rPr>
           <w:b/>
           <w:i/>
-          <w:color w:val="595959"/>
+          <w:color w:val="2D3748"/>
           <w:sz w:val="22"/>
         </w:rPr>
         <w:t>B. Yêu cầu phi tính năng (Non-Functional Requirements)</w:t>
@@ -903,7 +906,7 @@
     <w:p>
       <w:pPr>
         <w:pStyle w:val="ListBullet"/>
-        <w:spacing w:after="60" w:before="0"/>
+        <w:spacing w:after="60" w:before="0" w:line="276" w:lineRule="auto"/>
         <w:ind w:left="360"/>
       </w:pPr>
       <w:r>
@@ -919,7 +922,7 @@
     <w:p>
       <w:pPr>
         <w:pStyle w:val="ListBullet"/>
-        <w:spacing w:after="60" w:before="0"/>
+        <w:spacing w:after="60" w:before="0" w:line="276" w:lineRule="auto"/>
         <w:ind w:left="360"/>
       </w:pPr>
       <w:r>
@@ -935,7 +938,7 @@
     <w:p>
       <w:pPr>
         <w:pStyle w:val="ListBullet"/>
-        <w:spacing w:after="60" w:before="0"/>
+        <w:spacing w:after="60" w:before="0" w:line="276" w:lineRule="auto"/>
         <w:ind w:left="360"/>
       </w:pPr>
       <w:r>
@@ -951,7 +954,7 @@
     <w:p>
       <w:pPr>
         <w:pStyle w:val="ListBullet"/>
-        <w:spacing w:after="60" w:before="0"/>
+        <w:spacing w:after="60" w:before="0" w:line="276" w:lineRule="auto"/>
         <w:ind w:left="360"/>
       </w:pPr>
       <w:r>
@@ -968,7 +971,7 @@
       <w:pPr>
         <w:spacing w:before="240" w:after="240"/>
         <w:pBdr>
-          <w:bottom w:val="single" w:sz="6" w:space="1" w:color="4F81BD"/>
+          <w:bottom w:val="single" w:sz="6" w:space="1" w:color="2C5282"/>
         </w:pBdr>
       </w:pPr>
     </w:p>
@@ -980,7 +983,7 @@
       <w:r>
         <w:rPr>
           <w:b/>
-          <w:color w:val="595959"/>
+          <w:color w:val="2D3748"/>
           <w:sz w:val="24"/>
         </w:rPr>
         <w:t>3. Biên bản phê duyệt yêu cầu khách hàng</w:t>
@@ -989,6 +992,7 @@
     <w:p>
       <w:pPr>
         <w:spacing w:after="120" w:before="0" w:line="276" w:lineRule="auto"/>
+        <w:jc w:val="both"/>
       </w:pPr>
       <w:r>
         <w:t>Tài liệu yêu cầu kỹ thuật trên đã được hai bên xem xét và ký biên bản thống nhất nghiệm thu giai đoạn 1. Các tiêu chí nghiệm thu phần mềm cuối cùng sẽ được đối chiếu trực tiếp với các kịch bản kiểm thử mô tả chi tiết tại Mục IV.</w:t>
@@ -998,7 +1002,7 @@
       <w:pPr>
         <w:spacing w:before="240" w:after="240"/>
         <w:pBdr>
-          <w:bottom w:val="single" w:sz="6" w:space="1" w:color="4F81BD"/>
+          <w:bottom w:val="single" w:sz="6" w:space="1" w:color="2C5282"/>
         </w:pBdr>
       </w:pPr>
     </w:p>
@@ -1010,7 +1014,7 @@
       <w:r>
         <w:rPr>
           <w:b/>
-          <w:color w:val="1F4E79"/>
+          <w:color w:val="2D3748"/>
           <w:sz w:val="28"/>
         </w:rPr>
         <w:t>II. CÔNG ĐOẠN PHÂN TÍCH &amp; THIẾT KẾ</w:t>
@@ -1024,7 +1028,7 @@
       <w:r>
         <w:rPr>
           <w:b/>
-          <w:color w:val="595959"/>
+          <w:color w:val="2D3748"/>
           <w:sz w:val="24"/>
         </w:rPr>
         <w:t>1. Sơ đồ kiến trúc chi tiết (Detailed Architecture &amp; Data Flows)</w:t>
@@ -1033,6 +1037,7 @@
     <w:p>
       <w:pPr>
         <w:spacing w:after="120" w:before="0" w:line="276" w:lineRule="auto"/>
+        <w:jc w:val="both"/>
       </w:pPr>
       <w:r>
         <w:t>Kiến trúc phần mềm phân lớp tại thiết bị biên (Jetson Edge Node) được thiết kế theo mô hình Microservices giao tiếp phi trạng thái thông qua giao thức HTTP API nội bộ để đảm bảo tính module hóa và dễ bảo trì:</w:t>
@@ -1040,13 +1045,13 @@
     </w:p>
     <w:p>
       <w:pPr>
-        <w:spacing w:after="80" w:before="240"/>
+        <w:spacing w:before="240" w:after="80"/>
         <w:jc w:val="center"/>
       </w:pPr>
       <w:r>
         <w:drawing>
           <wp:inline xmlns:a="http://schemas.openxmlformats.org/drawingml/2006/main" xmlns:pic="http://schemas.openxmlformats.org/drawingml/2006/picture">
-            <wp:extent cx="5303520" cy="3856210"/>
+            <wp:extent cx="5486400" cy="4114800"/>
             <wp:docPr id="1" name="Picture 1"/>
             <wp:cNvGraphicFramePr>
               <a:graphicFrameLocks noChangeAspect="1"/>
@@ -1067,7 +1072,7 @@
                   <pic:spPr>
                     <a:xfrm>
                       <a:off x="0" y="0"/>
-                      <a:ext cx="5303520" cy="3856210"/>
+                      <a:ext cx="5486400" cy="4114800"/>
                     </a:xfrm>
                     <a:prstGeom prst="rect"/>
                   </pic:spPr>
@@ -1085,6 +1090,7 @@
       </w:pPr>
       <w:r>
         <w:rPr>
+          <w:rFonts w:ascii="Arial" w:hAnsi="Arial"/>
           <w:i/>
           <w:color w:val="646464"/>
           <w:sz w:val="19"/>
@@ -1096,7 +1102,7 @@
       <w:pPr>
         <w:spacing w:before="240" w:after="240"/>
         <w:pBdr>
-          <w:bottom w:val="single" w:sz="6" w:space="1" w:color="4F81BD"/>
+          <w:bottom w:val="single" w:sz="6" w:space="1" w:color="2C5282"/>
         </w:pBdr>
       </w:pPr>
     </w:p>
@@ -1108,7 +1114,7 @@
       <w:r>
         <w:rPr>
           <w:b/>
-          <w:color w:val="595959"/>
+          <w:color w:val="2D3748"/>
           <w:sz w:val="24"/>
         </w:rPr>
         <w:t>2. Sơ đồ cơ sở dữ liệu chi tiết (Detailed Database Diagram - ERD)</w:t>
@@ -1117,6 +1123,7 @@
     <w:p>
       <w:pPr>
         <w:spacing w:after="120" w:before="0" w:line="276" w:lineRule="auto"/>
+        <w:jc w:val="both"/>
       </w:pPr>
       <w:r>
         <w:t>Hệ thống lưu trữ dữ liệu tại biên dưới dạng cấu trúc tệp tin phân tán (JSON và CSV) phân luồng độc lập theo từng địa chỉ IP camera để tránh xung đột dữ liệu và tối ưu hiệu suất ghi đọc song song. Cấu trúc thực thể và mối quan hệ dữ liệu được mô tả chi tiết qua sơ đồ ERD dưới đây:</w:t>
@@ -1124,13 +1131,13 @@
     </w:p>
     <w:p>
       <w:pPr>
-        <w:spacing w:after="80" w:before="240"/>
+        <w:spacing w:before="240" w:after="80"/>
         <w:jc w:val="center"/>
       </w:pPr>
       <w:r>
         <w:drawing>
           <wp:inline xmlns:a="http://schemas.openxmlformats.org/drawingml/2006/main" xmlns:pic="http://schemas.openxmlformats.org/drawingml/2006/picture">
-            <wp:extent cx="5303520" cy="6205513"/>
+            <wp:extent cx="5486400" cy="4389120"/>
             <wp:docPr id="2" name="Picture 2"/>
             <wp:cNvGraphicFramePr>
               <a:graphicFrameLocks noChangeAspect="1"/>
@@ -1151,7 +1158,7 @@
                   <pic:spPr>
                     <a:xfrm>
                       <a:off x="0" y="0"/>
-                      <a:ext cx="5303520" cy="6205513"/>
+                      <a:ext cx="5486400" cy="4389120"/>
                     </a:xfrm>
                     <a:prstGeom prst="rect"/>
                   </pic:spPr>
@@ -1169,6 +1176,7 @@
       </w:pPr>
       <w:r>
         <w:rPr>
+          <w:rFonts w:ascii="Arial" w:hAnsi="Arial"/>
           <w:i/>
           <w:color w:val="646464"/>
           <w:sz w:val="19"/>
@@ -1185,7 +1193,7 @@
         <w:rPr>
           <w:b/>
           <w:i/>
-          <w:color w:val="595959"/>
+          <w:color w:val="2D3748"/>
           <w:sz w:val="22"/>
         </w:rPr>
         <w:t>A. Cấu trúc tập tin chứa danh sách tọa độ điểm đo nhiệt (`{camera_ip}_thermal_points.json`)</w:t>
@@ -1194,6 +1202,7 @@
     <w:p>
       <w:pPr>
         <w:spacing w:after="120" w:before="0" w:line="276" w:lineRule="auto"/>
+        <w:jc w:val="both"/>
       </w:pPr>
       <w:r>
         <w:t xml:space="preserve">File này lưu trữ tọa độ chuẩn hóa của các điểm cần theo dõi nhiệt độ trên ma trận ảnh nhiệt. Tọa độ </w:t>
@@ -1235,7 +1244,7 @@
     <w:p>
       <w:pPr>
         <w:pStyle w:val="ListBullet"/>
-        <w:spacing w:after="60" w:before="0"/>
+        <w:spacing w:after="60" w:before="0" w:line="276" w:lineRule="auto"/>
         <w:ind w:left="360"/>
       </w:pPr>
       <w:r>
@@ -1278,7 +1287,7 @@
             </w:tcMar>
             <w:tcBorders>
               <w:top w:val="single" w:sz="4" w:space="0" w:color="D3D3D3"/>
-              <w:left w:val="single" w:sz="18" w:space="0" w:color="1F4E79"/>
+              <w:left w:val="single" w:sz="18" w:space="0" w:color="2C5282"/>
               <w:bottom w:val="single" w:sz="4" w:space="0" w:color="D3D3D3"/>
               <w:right w:val="single" w:sz="4" w:space="0" w:color="D3D3D3"/>
             </w:tcBorders>
@@ -1355,7 +1364,7 @@
         <w:rPr>
           <w:b/>
           <w:i/>
-          <w:color w:val="595959"/>
+          <w:color w:val="2D3748"/>
           <w:sz w:val="22"/>
         </w:rPr>
         <w:t>B. Tập tin dữ liệu chuỗi thời gian lịch sử (`{camera_ip}_live_thermal_history.csv`)</w:t>
@@ -1364,6 +1373,7 @@
     <w:p>
       <w:pPr>
         <w:spacing w:after="120" w:before="0" w:line="276" w:lineRule="auto"/>
+        <w:jc w:val="both"/>
       </w:pPr>
       <w:r>
         <w:t>Lưu trữ toàn bộ lịch sử nhiệt độ thu thập được từ camera nhiệt. Cấu trúc file tự động thay đổi số lượng cột tương ứng với cấu hình trong tập tin JSON phía trên.</w:t>
@@ -1372,7 +1382,7 @@
     <w:p>
       <w:pPr>
         <w:pStyle w:val="ListBullet"/>
-        <w:spacing w:after="60" w:before="0"/>
+        <w:spacing w:after="60" w:before="0" w:line="276" w:lineRule="auto"/>
         <w:ind w:left="360"/>
       </w:pPr>
       <w:r>
@@ -1396,7 +1406,7 @@
     <w:p>
       <w:pPr>
         <w:pStyle w:val="ListBullet"/>
-        <w:spacing w:after="60" w:before="0"/>
+        <w:spacing w:after="60" w:before="0" w:line="276" w:lineRule="auto"/>
         <w:ind w:left="360"/>
       </w:pPr>
       <w:r>
@@ -1409,7 +1419,7 @@
     <w:p>
       <w:pPr>
         <w:pStyle w:val="ListBullet"/>
-        <w:spacing w:after="60" w:before="0"/>
+        <w:spacing w:after="60" w:before="0" w:line="276" w:lineRule="auto"/>
         <w:ind w:left="720"/>
       </w:pPr>
       <w:r>
@@ -1438,7 +1448,7 @@
     <w:p>
       <w:pPr>
         <w:pStyle w:val="ListBullet"/>
-        <w:spacing w:after="60" w:before="0"/>
+        <w:spacing w:after="60" w:before="0" w:line="276" w:lineRule="auto"/>
         <w:ind w:left="720"/>
       </w:pPr>
       <w:r>
@@ -1459,7 +1469,7 @@
     <w:p>
       <w:pPr>
         <w:pStyle w:val="ListBullet"/>
-        <w:spacing w:after="60" w:before="0"/>
+        <w:spacing w:after="60" w:before="0" w:line="276" w:lineRule="auto"/>
         <w:ind w:left="360"/>
       </w:pPr>
       <w:r>
@@ -1491,7 +1501,7 @@
             </w:tcMar>
             <w:tcBorders>
               <w:top w:val="single" w:sz="4" w:space="0" w:color="D3D3D3"/>
-              <w:left w:val="single" w:sz="18" w:space="0" w:color="1F4E79"/>
+              <w:left w:val="single" w:sz="18" w:space="0" w:color="2C5282"/>
               <w:bottom w:val="single" w:sz="4" w:space="0" w:color="D3D3D3"/>
               <w:right w:val="single" w:sz="4" w:space="0" w:color="D3D3D3"/>
             </w:tcBorders>
@@ -1534,7 +1544,7 @@
         <w:rPr>
           <w:b/>
           <w:i/>
-          <w:color w:val="595959"/>
+          <w:color w:val="2D3748"/>
           <w:sz w:val="22"/>
         </w:rPr>
         <w:t>C. Tập tin cấu hình học máy (`{camera_ip}_config.json`)</w:t>
@@ -1543,6 +1553,7 @@
     <w:p>
       <w:pPr>
         <w:spacing w:after="120" w:before="0" w:line="276" w:lineRule="auto"/>
+        <w:jc w:val="both"/>
       </w:pPr>
       <w:r>
         <w:t>Lưu các tham số cấu hình phục vụ quá trình tiền xử lý dữ liệu và huấn luyện mô hình dự báo MTKAN cục bộ.</w:t>
@@ -1551,7 +1562,7 @@
     <w:p>
       <w:pPr>
         <w:pStyle w:val="ListBullet"/>
-        <w:spacing w:after="60" w:before="0"/>
+        <w:spacing w:after="60" w:before="0" w:line="276" w:lineRule="auto"/>
         <w:ind w:left="360"/>
       </w:pPr>
       <w:r>
@@ -1594,7 +1605,7 @@
             </w:tcMar>
             <w:tcBorders>
               <w:top w:val="single" w:sz="4" w:space="0" w:color="D3D3D3"/>
-              <w:left w:val="single" w:sz="18" w:space="0" w:color="1F4E79"/>
+              <w:left w:val="single" w:sz="18" w:space="0" w:color="2C5282"/>
               <w:bottom w:val="single" w:sz="4" w:space="0" w:color="D3D3D3"/>
               <w:right w:val="single" w:sz="4" w:space="0" w:color="D3D3D3"/>
             </w:tcBorders>
@@ -1680,7 +1691,7 @@
       <w:pPr>
         <w:spacing w:before="240" w:after="240"/>
         <w:pBdr>
-          <w:bottom w:val="single" w:sz="6" w:space="1" w:color="4F81BD"/>
+          <w:bottom w:val="single" w:sz="6" w:space="1" w:color="2C5282"/>
         </w:pBdr>
       </w:pPr>
     </w:p>
@@ -1692,7 +1703,7 @@
       <w:r>
         <w:rPr>
           <w:b/>
-          <w:color w:val="595959"/>
+          <w:color w:val="2D3748"/>
           <w:sz w:val="24"/>
         </w:rPr>
         <w:t>3. Các sơ đồ phân tích thiết kế UML bổ sung (UML Diagrams)</w:t>
@@ -1701,6 +1712,7 @@
     <w:p>
       <w:pPr>
         <w:spacing w:after="120" w:before="0" w:line="276" w:lineRule="auto"/>
+        <w:jc w:val="both"/>
       </w:pPr>
       <w:r>
         <w:t>Để cung cấp góc nhìn kỹ thuật toàn diện về hành vi và cấu trúc tĩnh/động của phần mềm tại biên, dưới đây là các sơ đồ đặc tả UML chi tiết của hệ thống:</w:t>
@@ -1715,7 +1727,7 @@
         <w:rPr>
           <w:b/>
           <w:i/>
-          <w:color w:val="595959"/>
+          <w:color w:val="2D3748"/>
           <w:sz w:val="22"/>
         </w:rPr>
         <w:t>A. Sơ đồ Use Case (Use Case Diagram)</w:t>
@@ -1724,6 +1736,7 @@
     <w:p>
       <w:pPr>
         <w:spacing w:after="120" w:before="0" w:line="276" w:lineRule="auto"/>
+        <w:jc w:val="both"/>
       </w:pPr>
       <w:r>
         <w:t>Sơ đồ Use Case thể hiện các vai trò tương tác chính của các tác nhân (Vận hành viên, Nhân viên bảo vệ, Thiết bị biên và Máy chủ trung tâm) với các nhóm chức năng cốt lõi của phần mềm:</w:t>
@@ -1731,13 +1744,13 @@
     </w:p>
     <w:p>
       <w:pPr>
-        <w:spacing w:after="80" w:before="240"/>
+        <w:spacing w:before="240" w:after="80"/>
         <w:jc w:val="center"/>
       </w:pPr>
       <w:r>
         <w:drawing>
           <wp:inline xmlns:a="http://schemas.openxmlformats.org/drawingml/2006/main" xmlns:pic="http://schemas.openxmlformats.org/drawingml/2006/picture">
-            <wp:extent cx="5303520" cy="837102"/>
+            <wp:extent cx="5486400" cy="3840480"/>
             <wp:docPr id="3" name="Picture 3"/>
             <wp:cNvGraphicFramePr>
               <a:graphicFrameLocks noChangeAspect="1"/>
@@ -1758,7 +1771,7 @@
                   <pic:spPr>
                     <a:xfrm>
                       <a:off x="0" y="0"/>
-                      <a:ext cx="5303520" cy="837102"/>
+                      <a:ext cx="5486400" cy="3840480"/>
                     </a:xfrm>
                     <a:prstGeom prst="rect"/>
                   </pic:spPr>
@@ -1776,6 +1789,7 @@
       </w:pPr>
       <w:r>
         <w:rPr>
+          <w:rFonts w:ascii="Arial" w:hAnsi="Arial"/>
           <w:i/>
           <w:color w:val="646464"/>
           <w:sz w:val="19"/>
@@ -1792,7 +1806,7 @@
         <w:rPr>
           <w:b/>
           <w:i/>
-          <w:color w:val="595959"/>
+          <w:color w:val="2D3748"/>
           <w:sz w:val="22"/>
         </w:rPr>
         <w:t>B. Sơ đồ Lớp (Class Diagram)</w:t>
@@ -1801,6 +1815,7 @@
     <w:p>
       <w:pPr>
         <w:spacing w:after="120" w:before="0" w:line="276" w:lineRule="auto"/>
+        <w:jc w:val="both"/>
       </w:pPr>
       <w:r>
         <w:t>Sơ đồ mô tả cấu trúc tĩnh, các thuộc tính và phương thức của các lớp phần mềm chạy tại biên, đồng thời thể hiện mối quan hệ kế thừa/phụ thuộc giữa các module chức năng:</w:t>
@@ -1808,13 +1823,13 @@
     </w:p>
     <w:p>
       <w:pPr>
-        <w:spacing w:after="80" w:before="240"/>
+        <w:spacing w:before="240" w:after="80"/>
         <w:jc w:val="center"/>
       </w:pPr>
       <w:r>
         <w:drawing>
           <wp:inline xmlns:a="http://schemas.openxmlformats.org/drawingml/2006/main" xmlns:pic="http://schemas.openxmlformats.org/drawingml/2006/picture">
-            <wp:extent cx="5303520" cy="10368680"/>
+            <wp:extent cx="5486400" cy="3990109"/>
             <wp:docPr id="4" name="Picture 4"/>
             <wp:cNvGraphicFramePr>
               <a:graphicFrameLocks noChangeAspect="1"/>
@@ -1835,7 +1850,7 @@
                   <pic:spPr>
                     <a:xfrm>
                       <a:off x="0" y="0"/>
-                      <a:ext cx="5303520" cy="10368680"/>
+                      <a:ext cx="5486400" cy="3990109"/>
                     </a:xfrm>
                     <a:prstGeom prst="rect"/>
                   </pic:spPr>
@@ -1853,6 +1868,7 @@
       </w:pPr>
       <w:r>
         <w:rPr>
+          <w:rFonts w:ascii="Arial" w:hAnsi="Arial"/>
           <w:i/>
           <w:color w:val="646464"/>
           <w:sz w:val="19"/>
@@ -1869,7 +1885,7 @@
         <w:rPr>
           <w:b/>
           <w:i/>
-          <w:color w:val="595959"/>
+          <w:color w:val="2D3748"/>
           <w:sz w:val="22"/>
         </w:rPr>
         <w:t>C. Sơ đồ Hoạt động (Activity Diagram)</w:t>
@@ -1878,6 +1894,7 @@
     <w:p>
       <w:pPr>
         <w:spacing w:after="120" w:before="0" w:line="276" w:lineRule="auto"/>
+        <w:jc w:val="both"/>
       </w:pPr>
       <w:r>
         <w:t>Sơ đồ đặc tả luồng nghiệp vụ động của tiến trình tiếp nhận ma trận nhiệt độ từ camera vật lý, trích xuất điểm đo, tiền xử lý dữ liệu và kích hoạt cơ chế dự báo bằng mô hình MTKAN:</w:t>
@@ -1885,13 +1902,13 @@
     </w:p>
     <w:p>
       <w:pPr>
-        <w:spacing w:after="80" w:before="240"/>
+        <w:spacing w:before="240" w:after="80"/>
         <w:jc w:val="center"/>
       </w:pPr>
       <w:r>
         <w:drawing>
           <wp:inline xmlns:a="http://schemas.openxmlformats.org/drawingml/2006/main" xmlns:pic="http://schemas.openxmlformats.org/drawingml/2006/picture">
-            <wp:extent cx="5303520" cy="21008118"/>
+            <wp:extent cx="5486400" cy="8229600"/>
             <wp:docPr id="5" name="Picture 5"/>
             <wp:cNvGraphicFramePr>
               <a:graphicFrameLocks noChangeAspect="1"/>
@@ -1912,7 +1929,7 @@
                   <pic:spPr>
                     <a:xfrm>
                       <a:off x="0" y="0"/>
-                      <a:ext cx="5303520" cy="21008118"/>
+                      <a:ext cx="5486400" cy="8229600"/>
                     </a:xfrm>
                     <a:prstGeom prst="rect"/>
                   </pic:spPr>
@@ -1930,6 +1947,7 @@
       </w:pPr>
       <w:r>
         <w:rPr>
+          <w:rFonts w:ascii="Arial" w:hAnsi="Arial"/>
           <w:i/>
           <w:color w:val="646464"/>
           <w:sz w:val="19"/>
@@ -1946,7 +1964,7 @@
         <w:rPr>
           <w:b/>
           <w:i/>
-          <w:color w:val="595959"/>
+          <w:color w:val="2D3748"/>
           <w:sz w:val="22"/>
         </w:rPr>
         <w:t>D. Sơ đồ Trạng thái (State Diagram)</w:t>
@@ -1955,6 +1973,7 @@
     <w:p>
       <w:pPr>
         <w:spacing w:after="120" w:before="0" w:line="276" w:lineRule="auto"/>
+        <w:jc w:val="both"/>
       </w:pPr>
       <w:r>
         <w:t>Sơ đồ mô tả vòng đời và các bước chuyển đổi trạng thái của module nhận diện xâm nhập và ghi hình sự kiện động YOLO (phòng ngừa nhiễu flicking chuyển động):</w:t>
@@ -1962,13 +1981,13 @@
     </w:p>
     <w:p>
       <w:pPr>
-        <w:spacing w:after="80" w:before="240"/>
+        <w:spacing w:before="240" w:after="80"/>
         <w:jc w:val="center"/>
       </w:pPr>
       <w:r>
         <w:drawing>
           <wp:inline xmlns:a="http://schemas.openxmlformats.org/drawingml/2006/main" xmlns:pic="http://schemas.openxmlformats.org/drawingml/2006/picture">
-            <wp:extent cx="5303520" cy="10108723"/>
+            <wp:extent cx="5486400" cy="4876800"/>
             <wp:docPr id="6" name="Picture 6"/>
             <wp:cNvGraphicFramePr>
               <a:graphicFrameLocks noChangeAspect="1"/>
@@ -1989,7 +2008,7 @@
                   <pic:spPr>
                     <a:xfrm>
                       <a:off x="0" y="0"/>
-                      <a:ext cx="5303520" cy="10108723"/>
+                      <a:ext cx="5486400" cy="4876800"/>
                     </a:xfrm>
                     <a:prstGeom prst="rect"/>
                   </pic:spPr>
@@ -2007,6 +2026,7 @@
       </w:pPr>
       <w:r>
         <w:rPr>
+          <w:rFonts w:ascii="Arial" w:hAnsi="Arial"/>
           <w:i/>
           <w:color w:val="646464"/>
           <w:sz w:val="19"/>
@@ -2018,7 +2038,7 @@
       <w:pPr>
         <w:spacing w:before="240" w:after="240"/>
         <w:pBdr>
-          <w:bottom w:val="single" w:sz="6" w:space="1" w:color="4F81BD"/>
+          <w:bottom w:val="single" w:sz="6" w:space="1" w:color="2C5282"/>
         </w:pBdr>
       </w:pPr>
     </w:p>
@@ -2030,7 +2050,7 @@
       <w:r>
         <w:rPr>
           <w:b/>
-          <w:color w:val="595959"/>
+          <w:color w:val="2D3748"/>
           <w:sz w:val="24"/>
         </w:rPr>
         <w:t>4. Thiết kế giao diện người dùng (UI/UX Mockups)</w:t>
@@ -2039,6 +2059,7 @@
     <w:p>
       <w:pPr>
         <w:spacing w:after="120" w:before="0" w:line="276" w:lineRule="auto"/>
+        <w:jc w:val="both"/>
       </w:pPr>
       <w:r>
         <w:t>Giao diện Web Dashboard hiển thị tập trung tại Máy chủ Trung tâm bao gồm thiết kế bố cục đáp ứng như sau:</w:t>
@@ -2066,7 +2087,7 @@
             </w:tcMar>
             <w:tcBorders>
               <w:top w:val="single" w:sz="4" w:space="0" w:color="D3D3D3"/>
-              <w:left w:val="single" w:sz="18" w:space="0" w:color="1F4E79"/>
+              <w:left w:val="single" w:sz="18" w:space="0" w:color="2C5282"/>
               <w:bottom w:val="single" w:sz="4" w:space="0" w:color="D3D3D3"/>
               <w:right w:val="single" w:sz="4" w:space="0" w:color="D3D3D3"/>
             </w:tcBorders>
@@ -2144,7 +2165,7 @@
       <w:pPr>
         <w:spacing w:before="240" w:after="240"/>
         <w:pBdr>
-          <w:bottom w:val="single" w:sz="6" w:space="1" w:color="4F81BD"/>
+          <w:bottom w:val="single" w:sz="6" w:space="1" w:color="2C5282"/>
         </w:pBdr>
       </w:pPr>
     </w:p>
@@ -2156,7 +2177,7 @@
       <w:r>
         <w:rPr>
           <w:b/>
-          <w:color w:val="1F4E79"/>
+          <w:color w:val="2D3748"/>
           <w:sz w:val="28"/>
         </w:rPr>
         <w:t>III. CÔNG ĐOẠN LẬP TRÌNH &amp; VIẾT MÃ NGUỒN</w:t>
@@ -2170,7 +2191,7 @@
       <w:r>
         <w:rPr>
           <w:b/>
-          <w:color w:val="595959"/>
+          <w:color w:val="2D3748"/>
           <w:sz w:val="24"/>
         </w:rPr>
         <w:t>1. Nhật ký lập trình (Commit Log / Git Log)</w:t>
@@ -2179,6 +2200,7 @@
     <w:p>
       <w:pPr>
         <w:spacing w:after="120" w:before="0" w:line="276" w:lineRule="auto"/>
+        <w:jc w:val="both"/>
       </w:pPr>
       <w:r>
         <w:t>Lịch sử chi tiết toàn bộ các commit trong repository của dự án biên dịch hệ thống an ninh và phân tích nhiệt độ biên:</w:t>
@@ -2187,7 +2209,7 @@
     <w:p>
       <w:pPr>
         <w:pStyle w:val="ListBullet"/>
-        <w:spacing w:after="60" w:before="0"/>
+        <w:spacing w:after="60" w:before="0" w:line="276" w:lineRule="auto"/>
         <w:ind w:left="360"/>
       </w:pPr>
       <w:r>
@@ -2211,7 +2233,7 @@
     <w:p>
       <w:pPr>
         <w:pStyle w:val="ListBullet"/>
-        <w:spacing w:after="60" w:before="0"/>
+        <w:spacing w:after="60" w:before="0" w:line="276" w:lineRule="auto"/>
         <w:ind w:left="720"/>
       </w:pPr>
       <w:r>
@@ -2227,7 +2249,7 @@
     <w:p>
       <w:pPr>
         <w:pStyle w:val="ListBullet"/>
-        <w:spacing w:after="60" w:before="0"/>
+        <w:spacing w:after="60" w:before="0" w:line="276" w:lineRule="auto"/>
         <w:ind w:left="720"/>
       </w:pPr>
       <w:r>
@@ -2243,7 +2265,7 @@
     <w:p>
       <w:pPr>
         <w:pStyle w:val="ListBullet"/>
-        <w:spacing w:after="60" w:before="0"/>
+        <w:spacing w:after="60" w:before="0" w:line="276" w:lineRule="auto"/>
         <w:ind w:left="720"/>
       </w:pPr>
       <w:r>
@@ -2259,7 +2281,7 @@
     <w:p>
       <w:pPr>
         <w:pStyle w:val="ListBullet"/>
-        <w:spacing w:after="60" w:before="0"/>
+        <w:spacing w:after="60" w:before="0" w:line="276" w:lineRule="auto"/>
         <w:ind w:left="720"/>
       </w:pPr>
       <w:r>
@@ -2275,7 +2297,7 @@
     <w:p>
       <w:pPr>
         <w:pStyle w:val="ListBullet"/>
-        <w:spacing w:after="60" w:before="0"/>
+        <w:spacing w:after="60" w:before="0" w:line="276" w:lineRule="auto"/>
         <w:ind w:left="360"/>
       </w:pPr>
       <w:r>
@@ -2299,7 +2321,7 @@
     <w:p>
       <w:pPr>
         <w:pStyle w:val="ListBullet"/>
-        <w:spacing w:after="60" w:before="0"/>
+        <w:spacing w:after="60" w:before="0" w:line="276" w:lineRule="auto"/>
         <w:ind w:left="720"/>
       </w:pPr>
       <w:r>
@@ -2315,7 +2337,7 @@
     <w:p>
       <w:pPr>
         <w:pStyle w:val="ListBullet"/>
-        <w:spacing w:after="60" w:before="0"/>
+        <w:spacing w:after="60" w:before="0" w:line="276" w:lineRule="auto"/>
         <w:ind w:left="720"/>
       </w:pPr>
       <w:r>
@@ -2331,7 +2353,7 @@
     <w:p>
       <w:pPr>
         <w:pStyle w:val="ListBullet"/>
-        <w:spacing w:after="60" w:before="0"/>
+        <w:spacing w:after="60" w:before="0" w:line="276" w:lineRule="auto"/>
         <w:ind w:left="720"/>
       </w:pPr>
       <w:r>
@@ -2347,7 +2369,7 @@
     <w:p>
       <w:pPr>
         <w:pStyle w:val="ListBullet"/>
-        <w:spacing w:after="60" w:before="0"/>
+        <w:spacing w:after="60" w:before="0" w:line="276" w:lineRule="auto"/>
         <w:ind w:left="720"/>
       </w:pPr>
       <w:r>
@@ -2363,7 +2385,7 @@
     <w:p>
       <w:pPr>
         <w:pStyle w:val="ListBullet"/>
-        <w:spacing w:after="60" w:before="0"/>
+        <w:spacing w:after="60" w:before="0" w:line="276" w:lineRule="auto"/>
         <w:ind w:left="360"/>
       </w:pPr>
       <w:r>
@@ -2387,7 +2409,7 @@
     <w:p>
       <w:pPr>
         <w:pStyle w:val="ListBullet"/>
-        <w:spacing w:after="60" w:before="0"/>
+        <w:spacing w:after="60" w:before="0" w:line="276" w:lineRule="auto"/>
         <w:ind w:left="720"/>
       </w:pPr>
       <w:r>
@@ -2403,7 +2425,7 @@
     <w:p>
       <w:pPr>
         <w:pStyle w:val="ListBullet"/>
-        <w:spacing w:after="60" w:before="0"/>
+        <w:spacing w:after="60" w:before="0" w:line="276" w:lineRule="auto"/>
         <w:ind w:left="720"/>
       </w:pPr>
       <w:r>
@@ -2419,7 +2441,7 @@
     <w:p>
       <w:pPr>
         <w:pStyle w:val="ListBullet"/>
-        <w:spacing w:after="60" w:before="0"/>
+        <w:spacing w:after="60" w:before="0" w:line="276" w:lineRule="auto"/>
         <w:ind w:left="720"/>
       </w:pPr>
       <w:r>
@@ -2435,7 +2457,7 @@
     <w:p>
       <w:pPr>
         <w:pStyle w:val="ListBullet"/>
-        <w:spacing w:after="60" w:before="0"/>
+        <w:spacing w:after="60" w:before="0" w:line="276" w:lineRule="auto"/>
         <w:ind w:left="720"/>
       </w:pPr>
       <w:r>
@@ -2484,7 +2506,7 @@
     <w:p>
       <w:pPr>
         <w:pStyle w:val="ListBullet"/>
-        <w:spacing w:after="60" w:before="0"/>
+        <w:spacing w:after="60" w:before="0" w:line="276" w:lineRule="auto"/>
         <w:ind w:left="360"/>
       </w:pPr>
       <w:r>
@@ -2508,7 +2530,7 @@
     <w:p>
       <w:pPr>
         <w:pStyle w:val="ListBullet"/>
-        <w:spacing w:after="60" w:before="0"/>
+        <w:spacing w:after="60" w:before="0" w:line="276" w:lineRule="auto"/>
         <w:ind w:left="720"/>
       </w:pPr>
       <w:r>
@@ -2524,7 +2546,7 @@
     <w:p>
       <w:pPr>
         <w:pStyle w:val="ListBullet"/>
-        <w:spacing w:after="60" w:before="0"/>
+        <w:spacing w:after="60" w:before="0" w:line="276" w:lineRule="auto"/>
         <w:ind w:left="720"/>
       </w:pPr>
       <w:r>
@@ -2540,7 +2562,7 @@
     <w:p>
       <w:pPr>
         <w:pStyle w:val="ListBullet"/>
-        <w:spacing w:after="60" w:before="0"/>
+        <w:spacing w:after="60" w:before="0" w:line="276" w:lineRule="auto"/>
         <w:ind w:left="720"/>
       </w:pPr>
       <w:r>
@@ -2556,7 +2578,7 @@
     <w:p>
       <w:pPr>
         <w:pStyle w:val="ListBullet"/>
-        <w:spacing w:after="60" w:before="0"/>
+        <w:spacing w:after="60" w:before="0" w:line="276" w:lineRule="auto"/>
         <w:ind w:left="720"/>
       </w:pPr>
       <w:r>
@@ -2605,7 +2627,7 @@
     <w:p>
       <w:pPr>
         <w:pStyle w:val="ListBullet"/>
-        <w:spacing w:after="60" w:before="0"/>
+        <w:spacing w:after="60" w:before="0" w:line="276" w:lineRule="auto"/>
         <w:ind w:left="360"/>
       </w:pPr>
       <w:r>
@@ -2629,7 +2651,7 @@
     <w:p>
       <w:pPr>
         <w:pStyle w:val="ListBullet"/>
-        <w:spacing w:after="60" w:before="0"/>
+        <w:spacing w:after="60" w:before="0" w:line="276" w:lineRule="auto"/>
         <w:ind w:left="720"/>
       </w:pPr>
       <w:r>
@@ -2645,7 +2667,7 @@
     <w:p>
       <w:pPr>
         <w:pStyle w:val="ListBullet"/>
-        <w:spacing w:after="60" w:before="0"/>
+        <w:spacing w:after="60" w:before="0" w:line="276" w:lineRule="auto"/>
         <w:ind w:left="720"/>
       </w:pPr>
       <w:r>
@@ -2661,7 +2683,7 @@
     <w:p>
       <w:pPr>
         <w:pStyle w:val="ListBullet"/>
-        <w:spacing w:after="60" w:before="0"/>
+        <w:spacing w:after="60" w:before="0" w:line="276" w:lineRule="auto"/>
         <w:ind w:left="720"/>
       </w:pPr>
       <w:r>
@@ -2677,7 +2699,7 @@
     <w:p>
       <w:pPr>
         <w:pStyle w:val="ListBullet"/>
-        <w:spacing w:after="60" w:before="0"/>
+        <w:spacing w:after="60" w:before="0" w:line="276" w:lineRule="auto"/>
         <w:ind w:left="720"/>
       </w:pPr>
       <w:r>
@@ -2693,7 +2715,7 @@
     <w:p>
       <w:pPr>
         <w:pStyle w:val="ListBullet"/>
-        <w:spacing w:after="60" w:before="0"/>
+        <w:spacing w:after="60" w:before="0" w:line="276" w:lineRule="auto"/>
         <w:ind w:left="360"/>
       </w:pPr>
       <w:r>
@@ -2717,7 +2739,7 @@
     <w:p>
       <w:pPr>
         <w:pStyle w:val="ListBullet"/>
-        <w:spacing w:after="60" w:before="0"/>
+        <w:spacing w:after="60" w:before="0" w:line="276" w:lineRule="auto"/>
         <w:ind w:left="720"/>
       </w:pPr>
       <w:r>
@@ -2733,7 +2755,7 @@
     <w:p>
       <w:pPr>
         <w:pStyle w:val="ListBullet"/>
-        <w:spacing w:after="60" w:before="0"/>
+        <w:spacing w:after="60" w:before="0" w:line="276" w:lineRule="auto"/>
         <w:ind w:left="720"/>
       </w:pPr>
       <w:r>
@@ -2749,7 +2771,7 @@
     <w:p>
       <w:pPr>
         <w:pStyle w:val="ListBullet"/>
-        <w:spacing w:after="60" w:before="0"/>
+        <w:spacing w:after="60" w:before="0" w:line="276" w:lineRule="auto"/>
         <w:ind w:left="720"/>
       </w:pPr>
       <w:r>
@@ -2765,7 +2787,7 @@
     <w:p>
       <w:pPr>
         <w:pStyle w:val="ListBullet"/>
-        <w:spacing w:after="60" w:before="0"/>
+        <w:spacing w:after="60" w:before="0" w:line="276" w:lineRule="auto"/>
         <w:ind w:left="720"/>
       </w:pPr>
       <w:r>
@@ -2781,7 +2803,7 @@
     <w:p>
       <w:pPr>
         <w:pStyle w:val="ListBullet"/>
-        <w:spacing w:after="60" w:before="0"/>
+        <w:spacing w:after="60" w:before="0" w:line="276" w:lineRule="auto"/>
         <w:ind w:left="360"/>
       </w:pPr>
       <w:r>
@@ -2805,7 +2827,7 @@
     <w:p>
       <w:pPr>
         <w:pStyle w:val="ListBullet"/>
-        <w:spacing w:after="60" w:before="0"/>
+        <w:spacing w:after="60" w:before="0" w:line="276" w:lineRule="auto"/>
         <w:ind w:left="720"/>
       </w:pPr>
       <w:r>
@@ -2821,7 +2843,7 @@
     <w:p>
       <w:pPr>
         <w:pStyle w:val="ListBullet"/>
-        <w:spacing w:after="60" w:before="0"/>
+        <w:spacing w:after="60" w:before="0" w:line="276" w:lineRule="auto"/>
         <w:ind w:left="720"/>
       </w:pPr>
       <w:r>
@@ -2837,7 +2859,7 @@
     <w:p>
       <w:pPr>
         <w:pStyle w:val="ListBullet"/>
-        <w:spacing w:after="60" w:before="0"/>
+        <w:spacing w:after="60" w:before="0" w:line="276" w:lineRule="auto"/>
         <w:ind w:left="720"/>
       </w:pPr>
       <w:r>
@@ -2853,7 +2875,7 @@
     <w:p>
       <w:pPr>
         <w:pStyle w:val="ListBullet"/>
-        <w:spacing w:after="60" w:before="0"/>
+        <w:spacing w:after="60" w:before="0" w:line="276" w:lineRule="auto"/>
         <w:ind w:left="720"/>
       </w:pPr>
       <w:r>
@@ -2869,7 +2891,7 @@
     <w:p>
       <w:pPr>
         <w:pStyle w:val="ListBullet"/>
-        <w:spacing w:after="60" w:before="0"/>
+        <w:spacing w:after="60" w:before="0" w:line="276" w:lineRule="auto"/>
         <w:ind w:left="360"/>
       </w:pPr>
       <w:r>
@@ -2893,7 +2915,7 @@
     <w:p>
       <w:pPr>
         <w:pStyle w:val="ListBullet"/>
-        <w:spacing w:after="60" w:before="0"/>
+        <w:spacing w:after="60" w:before="0" w:line="276" w:lineRule="auto"/>
         <w:ind w:left="720"/>
       </w:pPr>
       <w:r>
@@ -2909,7 +2931,7 @@
     <w:p>
       <w:pPr>
         <w:pStyle w:val="ListBullet"/>
-        <w:spacing w:after="60" w:before="0"/>
+        <w:spacing w:after="60" w:before="0" w:line="276" w:lineRule="auto"/>
         <w:ind w:left="720"/>
       </w:pPr>
       <w:r>
@@ -2925,7 +2947,7 @@
     <w:p>
       <w:pPr>
         <w:pStyle w:val="ListBullet"/>
-        <w:spacing w:after="60" w:before="0"/>
+        <w:spacing w:after="60" w:before="0" w:line="276" w:lineRule="auto"/>
         <w:ind w:left="720"/>
       </w:pPr>
       <w:r>
@@ -2941,7 +2963,7 @@
     <w:p>
       <w:pPr>
         <w:pStyle w:val="ListBullet"/>
-        <w:spacing w:after="60" w:before="0"/>
+        <w:spacing w:after="60" w:before="0" w:line="276" w:lineRule="auto"/>
         <w:ind w:left="720"/>
       </w:pPr>
       <w:r>
@@ -2957,7 +2979,7 @@
     <w:p>
       <w:pPr>
         <w:pStyle w:val="ListBullet"/>
-        <w:spacing w:after="60" w:before="0"/>
+        <w:spacing w:after="60" w:before="0" w:line="276" w:lineRule="auto"/>
         <w:ind w:left="360"/>
       </w:pPr>
       <w:r>
@@ -2981,7 +3003,7 @@
     <w:p>
       <w:pPr>
         <w:pStyle w:val="ListBullet"/>
-        <w:spacing w:after="60" w:before="0"/>
+        <w:spacing w:after="60" w:before="0" w:line="276" w:lineRule="auto"/>
         <w:ind w:left="720"/>
       </w:pPr>
       <w:r>
@@ -2997,7 +3019,7 @@
     <w:p>
       <w:pPr>
         <w:pStyle w:val="ListBullet"/>
-        <w:spacing w:after="60" w:before="0"/>
+        <w:spacing w:after="60" w:before="0" w:line="276" w:lineRule="auto"/>
         <w:ind w:left="720"/>
       </w:pPr>
       <w:r>
@@ -3013,7 +3035,7 @@
     <w:p>
       <w:pPr>
         <w:pStyle w:val="ListBullet"/>
-        <w:spacing w:after="60" w:before="0"/>
+        <w:spacing w:after="60" w:before="0" w:line="276" w:lineRule="auto"/>
         <w:ind w:left="720"/>
       </w:pPr>
       <w:r>
@@ -3029,7 +3051,7 @@
     <w:p>
       <w:pPr>
         <w:pStyle w:val="ListBullet"/>
-        <w:spacing w:after="60" w:before="0"/>
+        <w:spacing w:after="60" w:before="0" w:line="276" w:lineRule="auto"/>
         <w:ind w:left="720"/>
       </w:pPr>
       <w:r>
@@ -3056,7 +3078,7 @@
     <w:p>
       <w:pPr>
         <w:pStyle w:val="ListBullet"/>
-        <w:spacing w:after="60" w:before="0"/>
+        <w:spacing w:after="60" w:before="0" w:line="276" w:lineRule="auto"/>
         <w:ind w:left="360"/>
       </w:pPr>
       <w:r>
@@ -3080,7 +3102,7 @@
     <w:p>
       <w:pPr>
         <w:pStyle w:val="ListBullet"/>
-        <w:spacing w:after="60" w:before="0"/>
+        <w:spacing w:after="60" w:before="0" w:line="276" w:lineRule="auto"/>
         <w:ind w:left="720"/>
       </w:pPr>
       <w:r>
@@ -3096,7 +3118,7 @@
     <w:p>
       <w:pPr>
         <w:pStyle w:val="ListBullet"/>
-        <w:spacing w:after="60" w:before="0"/>
+        <w:spacing w:after="60" w:before="0" w:line="276" w:lineRule="auto"/>
         <w:ind w:left="720"/>
       </w:pPr>
       <w:r>
@@ -3112,7 +3134,7 @@
     <w:p>
       <w:pPr>
         <w:pStyle w:val="ListBullet"/>
-        <w:spacing w:after="60" w:before="0"/>
+        <w:spacing w:after="60" w:before="0" w:line="276" w:lineRule="auto"/>
         <w:ind w:left="720"/>
       </w:pPr>
       <w:r>
@@ -3128,7 +3150,7 @@
     <w:p>
       <w:pPr>
         <w:pStyle w:val="ListBullet"/>
-        <w:spacing w:after="60" w:before="0"/>
+        <w:spacing w:after="60" w:before="0" w:line="276" w:lineRule="auto"/>
         <w:ind w:left="720"/>
       </w:pPr>
       <w:r>
@@ -3144,7 +3166,7 @@
     <w:p>
       <w:pPr>
         <w:pStyle w:val="ListBullet"/>
-        <w:spacing w:after="60" w:before="0"/>
+        <w:spacing w:after="60" w:before="0" w:line="276" w:lineRule="auto"/>
         <w:ind w:left="360"/>
       </w:pPr>
       <w:r>
@@ -3168,7 +3190,7 @@
     <w:p>
       <w:pPr>
         <w:pStyle w:val="ListBullet"/>
-        <w:spacing w:after="60" w:before="0"/>
+        <w:spacing w:after="60" w:before="0" w:line="276" w:lineRule="auto"/>
         <w:ind w:left="720"/>
       </w:pPr>
       <w:r>
@@ -3184,7 +3206,7 @@
     <w:p>
       <w:pPr>
         <w:pStyle w:val="ListBullet"/>
-        <w:spacing w:after="60" w:before="0"/>
+        <w:spacing w:after="60" w:before="0" w:line="276" w:lineRule="auto"/>
         <w:ind w:left="720"/>
       </w:pPr>
       <w:r>
@@ -3200,7 +3222,7 @@
     <w:p>
       <w:pPr>
         <w:pStyle w:val="ListBullet"/>
-        <w:spacing w:after="60" w:before="0"/>
+        <w:spacing w:after="60" w:before="0" w:line="276" w:lineRule="auto"/>
         <w:ind w:left="720"/>
       </w:pPr>
       <w:r>
@@ -3216,7 +3238,7 @@
     <w:p>
       <w:pPr>
         <w:pStyle w:val="ListBullet"/>
-        <w:spacing w:after="60" w:before="0"/>
+        <w:spacing w:after="60" w:before="0" w:line="276" w:lineRule="auto"/>
         <w:ind w:left="720"/>
       </w:pPr>
       <w:r>
@@ -3232,7 +3254,7 @@
     <w:p>
       <w:pPr>
         <w:pStyle w:val="ListBullet"/>
-        <w:spacing w:after="60" w:before="0"/>
+        <w:spacing w:after="60" w:before="0" w:line="276" w:lineRule="auto"/>
         <w:ind w:left="360"/>
       </w:pPr>
       <w:r>
@@ -3256,7 +3278,7 @@
     <w:p>
       <w:pPr>
         <w:pStyle w:val="ListBullet"/>
-        <w:spacing w:after="60" w:before="0"/>
+        <w:spacing w:after="60" w:before="0" w:line="276" w:lineRule="auto"/>
         <w:ind w:left="720"/>
       </w:pPr>
       <w:r>
@@ -3272,7 +3294,7 @@
     <w:p>
       <w:pPr>
         <w:pStyle w:val="ListBullet"/>
-        <w:spacing w:after="60" w:before="0"/>
+        <w:spacing w:after="60" w:before="0" w:line="276" w:lineRule="auto"/>
         <w:ind w:left="720"/>
       </w:pPr>
       <w:r>
@@ -3288,7 +3310,7 @@
     <w:p>
       <w:pPr>
         <w:pStyle w:val="ListBullet"/>
-        <w:spacing w:after="60" w:before="0"/>
+        <w:spacing w:after="60" w:before="0" w:line="276" w:lineRule="auto"/>
         <w:ind w:left="720"/>
       </w:pPr>
       <w:r>
@@ -3304,7 +3326,7 @@
     <w:p>
       <w:pPr>
         <w:pStyle w:val="ListBullet"/>
-        <w:spacing w:after="60" w:before="0"/>
+        <w:spacing w:after="60" w:before="0" w:line="276" w:lineRule="auto"/>
         <w:ind w:left="720"/>
       </w:pPr>
       <w:r>
@@ -3364,7 +3386,7 @@
     <w:p>
       <w:pPr>
         <w:pStyle w:val="ListBullet"/>
-        <w:spacing w:after="60" w:before="0"/>
+        <w:spacing w:after="60" w:before="0" w:line="276" w:lineRule="auto"/>
         <w:ind w:left="360"/>
       </w:pPr>
       <w:r>
@@ -3388,7 +3410,7 @@
     <w:p>
       <w:pPr>
         <w:pStyle w:val="ListBullet"/>
-        <w:spacing w:after="60" w:before="0"/>
+        <w:spacing w:after="60" w:before="0" w:line="276" w:lineRule="auto"/>
         <w:ind w:left="720"/>
       </w:pPr>
       <w:r>
@@ -3404,7 +3426,7 @@
     <w:p>
       <w:pPr>
         <w:pStyle w:val="ListBullet"/>
-        <w:spacing w:after="60" w:before="0"/>
+        <w:spacing w:after="60" w:before="0" w:line="276" w:lineRule="auto"/>
         <w:ind w:left="720"/>
       </w:pPr>
       <w:r>
@@ -3420,7 +3442,7 @@
     <w:p>
       <w:pPr>
         <w:pStyle w:val="ListBullet"/>
-        <w:spacing w:after="60" w:before="0"/>
+        <w:spacing w:after="60" w:before="0" w:line="276" w:lineRule="auto"/>
         <w:ind w:left="720"/>
       </w:pPr>
       <w:r>
@@ -3436,7 +3458,7 @@
     <w:p>
       <w:pPr>
         <w:pStyle w:val="ListBullet"/>
-        <w:spacing w:after="60" w:before="0"/>
+        <w:spacing w:after="60" w:before="0" w:line="276" w:lineRule="auto"/>
         <w:ind w:left="720"/>
       </w:pPr>
       <w:r>
@@ -3463,7 +3485,7 @@
     <w:p>
       <w:pPr>
         <w:pStyle w:val="ListBullet"/>
-        <w:spacing w:after="60" w:before="0"/>
+        <w:spacing w:after="60" w:before="0" w:line="276" w:lineRule="auto"/>
         <w:ind w:left="360"/>
       </w:pPr>
       <w:r>
@@ -3487,7 +3509,7 @@
     <w:p>
       <w:pPr>
         <w:pStyle w:val="ListBullet"/>
-        <w:spacing w:after="60" w:before="0"/>
+        <w:spacing w:after="60" w:before="0" w:line="276" w:lineRule="auto"/>
         <w:ind w:left="720"/>
       </w:pPr>
       <w:r>
@@ -3503,7 +3525,7 @@
     <w:p>
       <w:pPr>
         <w:pStyle w:val="ListBullet"/>
-        <w:spacing w:after="60" w:before="0"/>
+        <w:spacing w:after="60" w:before="0" w:line="276" w:lineRule="auto"/>
         <w:ind w:left="720"/>
       </w:pPr>
       <w:r>
@@ -3519,7 +3541,7 @@
     <w:p>
       <w:pPr>
         <w:pStyle w:val="ListBullet"/>
-        <w:spacing w:after="60" w:before="0"/>
+        <w:spacing w:after="60" w:before="0" w:line="276" w:lineRule="auto"/>
         <w:ind w:left="720"/>
       </w:pPr>
       <w:r>
@@ -3535,7 +3557,7 @@
     <w:p>
       <w:pPr>
         <w:pStyle w:val="ListBullet"/>
-        <w:spacing w:after="60" w:before="0"/>
+        <w:spacing w:after="60" w:before="0" w:line="276" w:lineRule="auto"/>
         <w:ind w:left="720"/>
       </w:pPr>
       <w:r>
@@ -3552,7 +3574,7 @@
       <w:pPr>
         <w:spacing w:before="240" w:after="240"/>
         <w:pBdr>
-          <w:bottom w:val="single" w:sz="6" w:space="1" w:color="4F81BD"/>
+          <w:bottom w:val="single" w:sz="6" w:space="1" w:color="2C5282"/>
         </w:pBdr>
       </w:pPr>
     </w:p>
@@ -3564,7 +3586,7 @@
       <w:r>
         <w:rPr>
           <w:b/>
-          <w:color w:val="595959"/>
+          <w:color w:val="2D3748"/>
           <w:sz w:val="24"/>
         </w:rPr>
         <w:t>2. Cấu trúc cây thư mục mã nguồn đầy đủ (Source Code Tree)</w:t>
@@ -3592,7 +3614,7 @@
             </w:tcMar>
             <w:tcBorders>
               <w:top w:val="single" w:sz="4" w:space="0" w:color="D3D3D3"/>
-              <w:left w:val="single" w:sz="18" w:space="0" w:color="1F4E79"/>
+              <w:left w:val="single" w:sz="18" w:space="0" w:color="2C5282"/>
               <w:bottom w:val="single" w:sz="4" w:space="0" w:color="D3D3D3"/>
               <w:right w:val="single" w:sz="4" w:space="0" w:color="D3D3D3"/>
             </w:tcBorders>
@@ -3766,7 +3788,7 @@
       <w:pPr>
         <w:spacing w:before="240" w:after="240"/>
         <w:pBdr>
-          <w:bottom w:val="single" w:sz="6" w:space="1" w:color="4F81BD"/>
+          <w:bottom w:val="single" w:sz="6" w:space="1" w:color="2C5282"/>
         </w:pBdr>
       </w:pPr>
     </w:p>
@@ -3778,7 +3800,7 @@
       <w:r>
         <w:rPr>
           <w:b/>
-          <w:color w:val="1F4E79"/>
+          <w:color w:val="2D3748"/>
           <w:sz w:val="28"/>
         </w:rPr>
         <w:t>IV. CÔNG ĐOẠN KIỂM THỬ &amp; SỬA LỖI (TESTING &amp; BUG REPORT)</w:t>
@@ -3792,7 +3814,7 @@
       <w:r>
         <w:rPr>
           <w:b/>
-          <w:color w:val="595959"/>
+          <w:color w:val="2D3748"/>
           <w:sz w:val="24"/>
         </w:rPr>
         <w:t>1. Kế hoạch kiểm thử hệ thống (System Test Plan)</w:t>
@@ -3801,7 +3823,7 @@
     <w:p>
       <w:pPr>
         <w:pStyle w:val="ListBullet"/>
-        <w:spacing w:after="60" w:before="0"/>
+        <w:spacing w:after="60" w:before="0" w:line="276" w:lineRule="auto"/>
         <w:ind w:left="360"/>
       </w:pPr>
       <w:r>
@@ -3817,7 +3839,7 @@
     <w:p>
       <w:pPr>
         <w:pStyle w:val="ListBullet"/>
-        <w:spacing w:after="60" w:before="0"/>
+        <w:spacing w:after="60" w:before="0" w:line="276" w:lineRule="auto"/>
         <w:ind w:left="360"/>
       </w:pPr>
       <w:r>
@@ -3830,7 +3852,7 @@
     <w:p>
       <w:pPr>
         <w:pStyle w:val="ListBullet"/>
-        <w:spacing w:after="60" w:before="0"/>
+        <w:spacing w:after="60" w:before="0" w:line="276" w:lineRule="auto"/>
         <w:ind w:left="720"/>
       </w:pPr>
       <w:r>
@@ -3846,7 +3868,7 @@
     <w:p>
       <w:pPr>
         <w:pStyle w:val="ListBullet"/>
-        <w:spacing w:after="60" w:before="0"/>
+        <w:spacing w:after="60" w:before="0" w:line="276" w:lineRule="auto"/>
         <w:ind w:left="720"/>
       </w:pPr>
       <w:r>
@@ -3862,7 +3884,7 @@
     <w:p>
       <w:pPr>
         <w:pStyle w:val="ListBullet"/>
-        <w:spacing w:after="60" w:before="0"/>
+        <w:spacing w:after="60" w:before="0" w:line="276" w:lineRule="auto"/>
         <w:ind w:left="360"/>
       </w:pPr>
       <w:r>
@@ -3875,7 +3897,7 @@
     <w:p>
       <w:pPr>
         <w:pStyle w:val="ListBullet"/>
-        <w:spacing w:after="60" w:before="0"/>
+        <w:spacing w:after="60" w:before="0" w:line="276" w:lineRule="auto"/>
         <w:ind w:left="720"/>
       </w:pPr>
       <w:r>
@@ -3885,7 +3907,7 @@
     <w:p>
       <w:pPr>
         <w:pStyle w:val="ListBullet"/>
-        <w:spacing w:after="60" w:before="0"/>
+        <w:spacing w:after="60" w:before="0" w:line="276" w:lineRule="auto"/>
         <w:ind w:left="720"/>
       </w:pPr>
       <w:r>
@@ -3895,7 +3917,7 @@
     <w:p>
       <w:pPr>
         <w:pStyle w:val="ListBullet"/>
-        <w:spacing w:after="60" w:before="0"/>
+        <w:spacing w:after="60" w:before="0" w:line="276" w:lineRule="auto"/>
         <w:ind w:left="720"/>
       </w:pPr>
       <w:r>
@@ -3905,7 +3927,7 @@
     <w:p>
       <w:pPr>
         <w:pStyle w:val="ListBullet"/>
-        <w:spacing w:after="60" w:before="0"/>
+        <w:spacing w:after="60" w:before="0" w:line="276" w:lineRule="auto"/>
         <w:ind w:left="720"/>
       </w:pPr>
       <w:r>
@@ -3916,7 +3938,7 @@
       <w:pPr>
         <w:spacing w:before="240" w:after="240"/>
         <w:pBdr>
-          <w:bottom w:val="single" w:sz="6" w:space="1" w:color="4F81BD"/>
+          <w:bottom w:val="single" w:sz="6" w:space="1" w:color="2C5282"/>
         </w:pBdr>
       </w:pPr>
     </w:p>
@@ -3928,7 +3950,7 @@
       <w:r>
         <w:rPr>
           <w:b/>
-          <w:color w:val="595959"/>
+          <w:color w:val="2D3748"/>
           <w:sz w:val="24"/>
         </w:rPr>
         <w:t>2. Kịch bản kiểm thử chi tiết (Detailed Test Cases)</w:t>
@@ -3943,7 +3965,7 @@
         <w:rPr>
           <w:b/>
           <w:i/>
-          <w:color w:val="595959"/>
+          <w:color w:val="2D3748"/>
           <w:sz w:val="22"/>
         </w:rPr>
         <w:t>TC-01: Nhận diện người xâm nhập và xuất video sự kiện MP4</w:t>
@@ -3952,7 +3974,7 @@
     <w:p>
       <w:pPr>
         <w:pStyle w:val="ListBullet"/>
-        <w:spacing w:after="60" w:before="0"/>
+        <w:spacing w:after="60" w:before="0" w:line="276" w:lineRule="auto"/>
         <w:ind w:left="360"/>
       </w:pPr>
       <w:r>
@@ -3968,7 +3990,7 @@
     <w:p>
       <w:pPr>
         <w:pStyle w:val="ListBullet"/>
-        <w:spacing w:after="60" w:before="0"/>
+        <w:spacing w:after="60" w:before="0" w:line="276" w:lineRule="auto"/>
         <w:ind w:left="360"/>
       </w:pPr>
       <w:r>
@@ -3984,7 +4006,7 @@
     <w:p>
       <w:pPr>
         <w:pStyle w:val="ListBullet"/>
-        <w:spacing w:after="60" w:before="0"/>
+        <w:spacing w:after="60" w:before="0" w:line="276" w:lineRule="auto"/>
         <w:ind w:left="360"/>
       </w:pPr>
       <w:r>
@@ -3997,7 +4019,7 @@
     <w:p>
       <w:pPr>
         <w:pStyle w:val="ListNumber"/>
-        <w:spacing w:after="60" w:before="0"/>
+        <w:spacing w:after="60" w:before="0" w:line="276" w:lineRule="auto"/>
         <w:ind w:left="720"/>
       </w:pPr>
       <w:r>
@@ -4029,7 +4051,7 @@
     <w:p>
       <w:pPr>
         <w:pStyle w:val="ListNumber"/>
-        <w:spacing w:after="60" w:before="0"/>
+        <w:spacing w:after="60" w:before="0" w:line="276" w:lineRule="auto"/>
         <w:ind w:left="720"/>
       </w:pPr>
       <w:r>
@@ -4050,7 +4072,7 @@
     <w:p>
       <w:pPr>
         <w:pStyle w:val="ListNumber"/>
-        <w:spacing w:after="60" w:before="0"/>
+        <w:spacing w:after="60" w:before="0" w:line="276" w:lineRule="auto"/>
         <w:ind w:left="720"/>
       </w:pPr>
       <w:r>
@@ -4060,7 +4082,7 @@
     <w:p>
       <w:pPr>
         <w:pStyle w:val="ListNumber"/>
-        <w:spacing w:after="60" w:before="0"/>
+        <w:spacing w:after="60" w:before="0" w:line="276" w:lineRule="auto"/>
         <w:ind w:left="720"/>
       </w:pPr>
       <w:r>
@@ -4081,7 +4103,7 @@
     <w:p>
       <w:pPr>
         <w:pStyle w:val="ListNumber"/>
-        <w:spacing w:after="60" w:before="0"/>
+        <w:spacing w:after="60" w:before="0" w:line="276" w:lineRule="auto"/>
         <w:ind w:left="720"/>
       </w:pPr>
       <w:r>
@@ -4091,7 +4113,7 @@
     <w:p>
       <w:pPr>
         <w:pStyle w:val="ListBullet"/>
-        <w:spacing w:after="60" w:before="0"/>
+        <w:spacing w:after="60" w:before="0" w:line="276" w:lineRule="auto"/>
         <w:ind w:left="360"/>
       </w:pPr>
       <w:r>
@@ -4104,7 +4126,7 @@
     <w:p>
       <w:pPr>
         <w:pStyle w:val="ListBullet"/>
-        <w:spacing w:after="60" w:before="0"/>
+        <w:spacing w:after="60" w:before="0" w:line="276" w:lineRule="auto"/>
         <w:ind w:left="720"/>
       </w:pPr>
       <w:r>
@@ -4122,7 +4144,7 @@
     <w:p>
       <w:pPr>
         <w:pStyle w:val="ListBullet"/>
-        <w:spacing w:after="60" w:before="0"/>
+        <w:spacing w:after="60" w:before="0" w:line="276" w:lineRule="auto"/>
         <w:ind w:left="720"/>
       </w:pPr>
       <w:r>
@@ -4132,7 +4154,7 @@
     <w:p>
       <w:pPr>
         <w:pStyle w:val="ListBullet"/>
-        <w:spacing w:after="60" w:before="0"/>
+        <w:spacing w:after="60" w:before="0" w:line="276" w:lineRule="auto"/>
         <w:ind w:left="720"/>
       </w:pPr>
       <w:r>
@@ -4142,7 +4164,7 @@
     <w:p>
       <w:pPr>
         <w:pStyle w:val="ListBullet"/>
-        <w:spacing w:after="60" w:before="0"/>
+        <w:spacing w:after="60" w:before="0" w:line="276" w:lineRule="auto"/>
         <w:ind w:left="360"/>
       </w:pPr>
       <w:r>
@@ -4164,7 +4186,7 @@
         <w:rPr>
           <w:b/>
           <w:i/>
-          <w:color w:val="595959"/>
+          <w:color w:val="2D3748"/>
           <w:sz w:val="22"/>
         </w:rPr>
         <w:t>TC-02: Lọc đối tượng giả dựa trên tỷ lệ khung chữ nhật (Aspect Ratio Filtering)</w:t>
@@ -4173,7 +4195,7 @@
     <w:p>
       <w:pPr>
         <w:pStyle w:val="ListBullet"/>
-        <w:spacing w:after="60" w:before="0"/>
+        <w:spacing w:after="60" w:before="0" w:line="276" w:lineRule="auto"/>
         <w:ind w:left="360"/>
       </w:pPr>
       <w:r>
@@ -4189,7 +4211,7 @@
     <w:p>
       <w:pPr>
         <w:pStyle w:val="ListBullet"/>
-        <w:spacing w:after="60" w:before="0"/>
+        <w:spacing w:after="60" w:before="0" w:line="276" w:lineRule="auto"/>
         <w:ind w:left="360"/>
       </w:pPr>
       <w:r>
@@ -4205,7 +4227,7 @@
     <w:p>
       <w:pPr>
         <w:pStyle w:val="ListBullet"/>
-        <w:spacing w:after="60" w:before="0"/>
+        <w:spacing w:after="60" w:before="0" w:line="276" w:lineRule="auto"/>
         <w:ind w:left="360"/>
       </w:pPr>
       <w:r>
@@ -4218,7 +4240,7 @@
     <w:p>
       <w:pPr>
         <w:pStyle w:val="ListNumber"/>
-        <w:spacing w:after="60" w:before="0"/>
+        <w:spacing w:after="60" w:before="0" w:line="276" w:lineRule="auto"/>
         <w:ind w:left="720"/>
       </w:pPr>
       <w:r>
@@ -4228,7 +4250,7 @@
     <w:p>
       <w:pPr>
         <w:pStyle w:val="ListNumber"/>
-        <w:spacing w:after="60" w:before="0"/>
+        <w:spacing w:after="60" w:before="0" w:line="276" w:lineRule="auto"/>
         <w:ind w:left="720"/>
       </w:pPr>
       <w:r>
@@ -4238,7 +4260,7 @@
     <w:p>
       <w:pPr>
         <w:pStyle w:val="ListNumber"/>
-        <w:spacing w:after="60" w:before="0"/>
+        <w:spacing w:after="60" w:before="0" w:line="276" w:lineRule="auto"/>
         <w:ind w:left="720"/>
       </w:pPr>
       <w:r>
@@ -4248,7 +4270,7 @@
     <w:p>
       <w:pPr>
         <w:pStyle w:val="ListBullet"/>
-        <w:spacing w:after="60" w:before="0"/>
+        <w:spacing w:after="60" w:before="0" w:line="276" w:lineRule="auto"/>
         <w:ind w:left="360"/>
       </w:pPr>
       <w:r>
@@ -4261,7 +4283,7 @@
     <w:p>
       <w:pPr>
         <w:pStyle w:val="ListBullet"/>
-        <w:spacing w:after="60" w:before="0"/>
+        <w:spacing w:after="60" w:before="0" w:line="276" w:lineRule="auto"/>
         <w:ind w:left="720"/>
       </w:pPr>
       <w:r>
@@ -4293,7 +4315,7 @@
     <w:p>
       <w:pPr>
         <w:pStyle w:val="ListBullet"/>
-        <w:spacing w:after="60" w:before="0"/>
+        <w:spacing w:after="60" w:before="0" w:line="276" w:lineRule="auto"/>
         <w:ind w:left="720"/>
       </w:pPr>
       <w:r>
@@ -4314,7 +4336,7 @@
     <w:p>
       <w:pPr>
         <w:pStyle w:val="ListBullet"/>
-        <w:spacing w:after="60" w:before="0"/>
+        <w:spacing w:after="60" w:before="0" w:line="276" w:lineRule="auto"/>
         <w:ind w:left="360"/>
       </w:pPr>
       <w:r>
@@ -4336,7 +4358,7 @@
         <w:rPr>
           <w:b/>
           <w:i/>
-          <w:color w:val="595959"/>
+          <w:color w:val="2D3748"/>
           <w:sz w:val="22"/>
         </w:rPr>
         <w:t>TC-03: Tự động đồng bộ Schema CSV khi thêm điểm đo nhiệt độ mới</w:t>
@@ -4345,7 +4367,7 @@
     <w:p>
       <w:pPr>
         <w:pStyle w:val="ListBullet"/>
-        <w:spacing w:after="60" w:before="0"/>
+        <w:spacing w:after="60" w:before="0" w:line="276" w:lineRule="auto"/>
         <w:ind w:left="360"/>
       </w:pPr>
       <w:r>
@@ -4361,7 +4383,7 @@
     <w:p>
       <w:pPr>
         <w:pStyle w:val="ListBullet"/>
-        <w:spacing w:after="60" w:before="0"/>
+        <w:spacing w:after="60" w:before="0" w:line="276" w:lineRule="auto"/>
         <w:ind w:left="360"/>
       </w:pPr>
       <w:r>
@@ -4410,7 +4432,7 @@
     <w:p>
       <w:pPr>
         <w:pStyle w:val="ListBullet"/>
-        <w:spacing w:after="60" w:before="0"/>
+        <w:spacing w:after="60" w:before="0" w:line="276" w:lineRule="auto"/>
         <w:ind w:left="360"/>
       </w:pPr>
       <w:r>
@@ -4423,7 +4445,7 @@
     <w:p>
       <w:pPr>
         <w:pStyle w:val="ListNumber"/>
-        <w:spacing w:after="60" w:before="0"/>
+        <w:spacing w:after="60" w:before="0" w:line="276" w:lineRule="auto"/>
         <w:ind w:left="720"/>
       </w:pPr>
       <w:r>
@@ -4444,7 +4466,7 @@
     <w:p>
       <w:pPr>
         <w:pStyle w:val="ListNumber"/>
-        <w:spacing w:after="60" w:before="0"/>
+        <w:spacing w:after="60" w:before="0" w:line="276" w:lineRule="auto"/>
         <w:ind w:left="720"/>
       </w:pPr>
       <w:r>
@@ -4465,7 +4487,7 @@
     <w:p>
       <w:pPr>
         <w:pStyle w:val="ListNumber"/>
-        <w:spacing w:after="60" w:before="0"/>
+        <w:spacing w:after="60" w:before="0" w:line="276" w:lineRule="auto"/>
         <w:ind w:left="720"/>
       </w:pPr>
       <w:r>
@@ -4486,7 +4508,7 @@
     <w:p>
       <w:pPr>
         <w:pStyle w:val="ListBullet"/>
-        <w:spacing w:after="60" w:before="0"/>
+        <w:spacing w:after="60" w:before="0" w:line="276" w:lineRule="auto"/>
         <w:ind w:left="360"/>
       </w:pPr>
       <w:r>
@@ -4499,7 +4521,7 @@
     <w:p>
       <w:pPr>
         <w:pStyle w:val="ListBullet"/>
-        <w:spacing w:after="60" w:before="0"/>
+        <w:spacing w:after="60" w:before="0" w:line="276" w:lineRule="auto"/>
         <w:ind w:left="720"/>
       </w:pPr>
       <w:r>
@@ -4520,7 +4542,7 @@
     <w:p>
       <w:pPr>
         <w:pStyle w:val="ListBullet"/>
-        <w:spacing w:after="60" w:before="0"/>
+        <w:spacing w:after="60" w:before="0" w:line="276" w:lineRule="auto"/>
         <w:ind w:left="720"/>
       </w:pPr>
       <w:r>
@@ -4552,7 +4574,7 @@
     <w:p>
       <w:pPr>
         <w:pStyle w:val="ListBullet"/>
-        <w:spacing w:after="60" w:before="0"/>
+        <w:spacing w:after="60" w:before="0" w:line="276" w:lineRule="auto"/>
         <w:ind w:left="720"/>
       </w:pPr>
       <w:r>
@@ -4562,7 +4584,7 @@
     <w:p>
       <w:pPr>
         <w:pStyle w:val="ListBullet"/>
-        <w:spacing w:after="60" w:before="0"/>
+        <w:spacing w:after="60" w:before="0" w:line="276" w:lineRule="auto"/>
         <w:ind w:left="360"/>
       </w:pPr>
       <w:r>
@@ -4595,7 +4617,7 @@
         <w:rPr>
           <w:b/>
           <w:i/>
-          <w:color w:val="595959"/>
+          <w:color w:val="2D3748"/>
           <w:sz w:val="22"/>
         </w:rPr>
         <w:t>TC-04: Phục hồi luồng camera RTSP tự động khi mất tín hiệu mạng (Auto-Reconnect)</w:t>
@@ -4604,7 +4626,7 @@
     <w:p>
       <w:pPr>
         <w:pStyle w:val="ListBullet"/>
-        <w:spacing w:after="60" w:before="0"/>
+        <w:spacing w:after="60" w:before="0" w:line="276" w:lineRule="auto"/>
         <w:ind w:left="360"/>
       </w:pPr>
       <w:r>
@@ -4620,7 +4642,7 @@
     <w:p>
       <w:pPr>
         <w:pStyle w:val="ListBullet"/>
-        <w:spacing w:after="60" w:before="0"/>
+        <w:spacing w:after="60" w:before="0" w:line="276" w:lineRule="auto"/>
         <w:ind w:left="360"/>
       </w:pPr>
       <w:r>
@@ -4636,7 +4658,7 @@
     <w:p>
       <w:pPr>
         <w:pStyle w:val="ListBullet"/>
-        <w:spacing w:after="60" w:before="0"/>
+        <w:spacing w:after="60" w:before="0" w:line="276" w:lineRule="auto"/>
         <w:ind w:left="360"/>
       </w:pPr>
       <w:r>
@@ -4649,7 +4671,7 @@
     <w:p>
       <w:pPr>
         <w:pStyle w:val="ListNumber"/>
-        <w:spacing w:after="60" w:before="0"/>
+        <w:spacing w:after="60" w:before="0" w:line="276" w:lineRule="auto"/>
         <w:ind w:left="720"/>
       </w:pPr>
       <w:r>
@@ -4659,7 +4681,7 @@
     <w:p>
       <w:pPr>
         <w:pStyle w:val="ListNumber"/>
-        <w:spacing w:after="60" w:before="0"/>
+        <w:spacing w:after="60" w:before="0" w:line="276" w:lineRule="auto"/>
         <w:ind w:left="720"/>
       </w:pPr>
       <w:r>
@@ -4669,7 +4691,7 @@
     <w:p>
       <w:pPr>
         <w:pStyle w:val="ListNumber"/>
-        <w:spacing w:after="60" w:before="0"/>
+        <w:spacing w:after="60" w:before="0" w:line="276" w:lineRule="auto"/>
         <w:ind w:left="720"/>
       </w:pPr>
       <w:r>
@@ -4679,7 +4701,7 @@
     <w:p>
       <w:pPr>
         <w:pStyle w:val="ListNumber"/>
-        <w:spacing w:after="60" w:before="0"/>
+        <w:spacing w:after="60" w:before="0" w:line="276" w:lineRule="auto"/>
         <w:ind w:left="720"/>
       </w:pPr>
       <w:r>
@@ -4689,7 +4711,7 @@
     <w:p>
       <w:pPr>
         <w:pStyle w:val="ListBullet"/>
-        <w:spacing w:after="60" w:before="0"/>
+        <w:spacing w:after="60" w:before="0" w:line="276" w:lineRule="auto"/>
         <w:ind w:left="360"/>
       </w:pPr>
       <w:r>
@@ -4702,7 +4724,7 @@
     <w:p>
       <w:pPr>
         <w:pStyle w:val="ListBullet"/>
-        <w:spacing w:after="60" w:before="0"/>
+        <w:spacing w:after="60" w:before="0" w:line="276" w:lineRule="auto"/>
         <w:ind w:left="720"/>
       </w:pPr>
       <w:r>
@@ -4720,7 +4742,7 @@
     <w:p>
       <w:pPr>
         <w:pStyle w:val="ListBullet"/>
-        <w:spacing w:after="60" w:before="0"/>
+        <w:spacing w:after="60" w:before="0" w:line="276" w:lineRule="auto"/>
         <w:ind w:left="720"/>
       </w:pPr>
       <w:r>
@@ -4730,7 +4752,7 @@
     <w:p>
       <w:pPr>
         <w:pStyle w:val="ListBullet"/>
-        <w:spacing w:after="60" w:before="0"/>
+        <w:spacing w:after="60" w:before="0" w:line="276" w:lineRule="auto"/>
         <w:ind w:left="720"/>
       </w:pPr>
       <w:r>
@@ -4751,7 +4773,7 @@
     <w:p>
       <w:pPr>
         <w:pStyle w:val="ListBullet"/>
-        <w:spacing w:after="60" w:before="0"/>
+        <w:spacing w:after="60" w:before="0" w:line="276" w:lineRule="auto"/>
         <w:ind w:left="360"/>
       </w:pPr>
       <w:r>
@@ -4768,7 +4790,7 @@
       <w:pPr>
         <w:spacing w:before="240" w:after="240"/>
         <w:pBdr>
-          <w:bottom w:val="single" w:sz="6" w:space="1" w:color="4F81BD"/>
+          <w:bottom w:val="single" w:sz="6" w:space="1" w:color="2C5282"/>
         </w:pBdr>
       </w:pPr>
     </w:p>
@@ -4780,7 +4802,7 @@
       <w:r>
         <w:rPr>
           <w:b/>
-          <w:color w:val="595959"/>
+          <w:color w:val="2D3748"/>
           <w:sz w:val="24"/>
         </w:rPr>
         <w:t>3. Nhật ký sửa lỗi (Bug Report &amp; Patches)</w:t>
@@ -4789,6 +4811,7 @@
     <w:p>
       <w:pPr>
         <w:spacing w:after="120" w:before="0" w:line="276" w:lineRule="auto"/>
+        <w:jc w:val="both"/>
       </w:pPr>
       <w:r>
         <w:t>Dưới đây là báo cáo chi tiết về 6 lỗi kỹ thuật quan trọng phát sinh trong quá trình xây dựng hệ thống tại thiết bị biên và giải pháp khắc phục logic tương ứng:</w:t>
@@ -4803,7 +4826,7 @@
         <w:rPr>
           <w:b/>
           <w:i/>
-          <w:color w:val="595959"/>
+          <w:color w:val="2D3748"/>
           <w:sz w:val="22"/>
         </w:rPr>
         <w:t>Bug #01: Lỗi bất tương thích kích thước Scaler (Scaler Shape Mismatch) trong tiến trình huấn luyện lại mô hình (Auto-retrain)</w:t>
@@ -4812,7 +4835,7 @@
     <w:p>
       <w:pPr>
         <w:pStyle w:val="ListBullet"/>
-        <w:spacing w:after="60" w:before="0"/>
+        <w:spacing w:after="60" w:before="0" w:line="276" w:lineRule="auto"/>
         <w:ind w:left="360"/>
       </w:pPr>
       <w:r>
@@ -4861,7 +4884,7 @@
     <w:p>
       <w:pPr>
         <w:pStyle w:val="ListBullet"/>
-        <w:spacing w:after="60" w:before="0"/>
+        <w:spacing w:after="60" w:before="0" w:line="276" w:lineRule="auto"/>
         <w:ind w:left="360"/>
       </w:pPr>
       <w:r>
@@ -4927,7 +4950,7 @@
         <w:rPr>
           <w:b/>
           <w:i/>
-          <w:color w:val="595959"/>
+          <w:color w:val="2D3748"/>
           <w:sz w:val="22"/>
         </w:rPr>
         <w:t>Bug #02: Lỗi bùng nổ giá trị dự báo (Exploding predictions) do mất gói dữ liệu nhiệt độ</w:t>
@@ -4936,7 +4959,7 @@
     <w:p>
       <w:pPr>
         <w:pStyle w:val="ListBullet"/>
-        <w:spacing w:after="60" w:before="0"/>
+        <w:spacing w:after="60" w:before="0" w:line="276" w:lineRule="auto"/>
         <w:ind w:left="360"/>
       </w:pPr>
       <w:r>
@@ -4985,7 +5008,7 @@
     <w:p>
       <w:pPr>
         <w:pStyle w:val="ListBullet"/>
-        <w:spacing w:after="60" w:before="0"/>
+        <w:spacing w:after="60" w:before="0" w:line="276" w:lineRule="auto"/>
         <w:ind w:left="360"/>
       </w:pPr>
       <w:r>
@@ -5029,7 +5052,7 @@
         <w:rPr>
           <w:b/>
           <w:i/>
-          <w:color w:val="595959"/>
+          <w:color w:val="2D3748"/>
           <w:sz w:val="22"/>
         </w:rPr>
         <w:t>Bug #03: Lỗi mất kết nối và rò rỉ bộ nhớ luồng camera RTSP (OpenCV/FFmpeg Stream Timeout)</w:t>
@@ -5038,7 +5061,7 @@
     <w:p>
       <w:pPr>
         <w:pStyle w:val="ListBullet"/>
-        <w:spacing w:after="60" w:before="0"/>
+        <w:spacing w:after="60" w:before="0" w:line="276" w:lineRule="auto"/>
         <w:ind w:left="360"/>
       </w:pPr>
       <w:r>
@@ -5054,7 +5077,7 @@
     <w:p>
       <w:pPr>
         <w:pStyle w:val="ListBullet"/>
-        <w:spacing w:after="60" w:before="0"/>
+        <w:spacing w:after="60" w:before="0" w:line="276" w:lineRule="auto"/>
         <w:ind w:left="360"/>
       </w:pPr>
       <w:r>
@@ -5076,7 +5099,7 @@
         <w:rPr>
           <w:b/>
           <w:i/>
-          <w:color w:val="595959"/>
+          <w:color w:val="2D3748"/>
           <w:sz w:val="22"/>
         </w:rPr>
         <w:t>Bug #04: Lỗi ghi đè/xung đột dữ liệu khi chạy đa camera đồng thời (Multi-camera Data Partitioning)</w:t>
@@ -5085,7 +5108,7 @@
     <w:p>
       <w:pPr>
         <w:pStyle w:val="ListBullet"/>
-        <w:spacing w:after="60" w:before="0"/>
+        <w:spacing w:after="60" w:before="0" w:line="276" w:lineRule="auto"/>
         <w:ind w:left="360"/>
       </w:pPr>
       <w:r>
@@ -5101,7 +5124,7 @@
     <w:p>
       <w:pPr>
         <w:pStyle w:val="ListBullet"/>
-        <w:spacing w:after="60" w:before="0"/>
+        <w:spacing w:after="60" w:before="0" w:line="276" w:lineRule="auto"/>
         <w:ind w:left="360"/>
       </w:pPr>
       <w:r>
@@ -5145,7 +5168,7 @@
         <w:rPr>
           <w:b/>
           <w:i/>
-          <w:color w:val="595959"/>
+          <w:color w:val="2D3748"/>
           <w:sz w:val="22"/>
         </w:rPr>
         <w:t>Bug #05: Lỗi gửi cảnh báo trùng lặp liên tục (Alert Spam / Flood) khi phát hiện người xâm nhập</w:t>
@@ -5154,7 +5177,7 @@
     <w:p>
       <w:pPr>
         <w:pStyle w:val="ListBullet"/>
-        <w:spacing w:after="60" w:before="0"/>
+        <w:spacing w:after="60" w:before="0" w:line="276" w:lineRule="auto"/>
         <w:ind w:left="360"/>
       </w:pPr>
       <w:r>
@@ -5170,7 +5193,7 @@
     <w:p>
       <w:pPr>
         <w:pStyle w:val="ListBullet"/>
-        <w:spacing w:after="60" w:before="0"/>
+        <w:spacing w:after="60" w:before="0" w:line="276" w:lineRule="auto"/>
         <w:ind w:left="360"/>
       </w:pPr>
       <w:r>
@@ -5192,7 +5215,7 @@
         <w:rPr>
           <w:b/>
           <w:i/>
-          <w:color w:val="595959"/>
+          <w:color w:val="2D3748"/>
           <w:sz w:val="22"/>
         </w:rPr>
         <w:t>Bug #06: Lỗi sai lệch URL callback phản hồi dữ liệu dự báo khi IP máy chủ trung tâm thay đổi động</w:t>
@@ -5201,7 +5224,7 @@
     <w:p>
       <w:pPr>
         <w:pStyle w:val="ListBullet"/>
-        <w:spacing w:after="60" w:before="0"/>
+        <w:spacing w:after="60" w:before="0" w:line="276" w:lineRule="auto"/>
         <w:ind w:left="360"/>
       </w:pPr>
       <w:r>
@@ -5228,7 +5251,7 @@
     <w:p>
       <w:pPr>
         <w:pStyle w:val="ListBullet"/>
-        <w:spacing w:after="60" w:before="0"/>
+        <w:spacing w:after="60" w:before="0" w:line="276" w:lineRule="auto"/>
         <w:ind w:left="360"/>
       </w:pPr>
       <w:r>
@@ -5245,7 +5268,7 @@
       <w:pPr>
         <w:spacing w:before="240" w:after="240"/>
         <w:pBdr>
-          <w:bottom w:val="single" w:sz="6" w:space="1" w:color="4F81BD"/>
+          <w:bottom w:val="single" w:sz="6" w:space="1" w:color="2C5282"/>
         </w:pBdr>
       </w:pPr>
     </w:p>
@@ -5257,7 +5280,7 @@
       <w:r>
         <w:rPr>
           <w:b/>
-          <w:color w:val="1F4E79"/>
+          <w:color w:val="2D3748"/>
           <w:sz w:val="28"/>
         </w:rPr>
         <w:t>V. CÔNG ĐOẠN BÀN GIAO &amp; NGHIỆM THU</w:t>
@@ -5271,7 +5294,7 @@
       <w:r>
         <w:rPr>
           <w:b/>
-          <w:color w:val="595959"/>
+          <w:color w:val="2D3748"/>
           <w:sz w:val="24"/>
         </w:rPr>
         <w:t>1. Biên bản nghiệm thu kỹ thuật và bàn giao sản phẩm</w:t>
@@ -5280,6 +5303,7 @@
     <w:p>
       <w:pPr>
         <w:spacing w:after="120" w:before="0" w:line="276" w:lineRule="auto"/>
+        <w:jc w:val="both"/>
       </w:pPr>
       <w:r>
         <w:t>Hội đồng nghiệm thu thống nhất ký biên bản xác nhận bàn giao bộ sản phẩm phần mềm của dự án "Smart Camera Edge System" cho đơn vị vận hành trạm biến áp 110kV. Các tài nguyên bàn giao bao gồm toàn bộ cấu trúc thư mục mã nguồn được thiết lập tại biên Jetson cùng các mô hình AI tối ưu.</w:t>
@@ -5289,7 +5313,7 @@
       <w:pPr>
         <w:spacing w:before="240" w:after="240"/>
         <w:pBdr>
-          <w:bottom w:val="single" w:sz="6" w:space="1" w:color="4F81BD"/>
+          <w:bottom w:val="single" w:sz="6" w:space="1" w:color="2C5282"/>
         </w:pBdr>
       </w:pPr>
     </w:p>
@@ -5301,7 +5325,7 @@
       <w:r>
         <w:rPr>
           <w:b/>
-          <w:color w:val="595959"/>
+          <w:color w:val="2D3748"/>
           <w:sz w:val="24"/>
         </w:rPr>
         <w:t>2. Hướng dẫn sử dụng &amp; vận hành hệ thống (User &amp; Operations Guide)</w:t>
@@ -5316,7 +5340,7 @@
         <w:rPr>
           <w:b/>
           <w:i/>
-          <w:color w:val="595959"/>
+          <w:color w:val="2D3748"/>
           <w:sz w:val="22"/>
         </w:rPr>
         <w:t>A. Cài đặt các thư viện phụ thuộc (Dependencies Installation)</w:t>
@@ -5325,6 +5349,7 @@
     <w:p>
       <w:pPr>
         <w:spacing w:after="120" w:before="0" w:line="276" w:lineRule="auto"/>
+        <w:jc w:val="both"/>
       </w:pPr>
       <w:r>
         <w:t xml:space="preserve">Hệ thống biên yêu cầu môi trường JetPack của NVIDIA đã cài đặt sẵn CUDA và TensorRT. Thực hiện cài đặt các thư viện Python bổ trợ thông qua tệp </w:t>
@@ -5363,7 +5388,7 @@
             </w:tcMar>
             <w:tcBorders>
               <w:top w:val="single" w:sz="4" w:space="0" w:color="D3D3D3"/>
-              <w:left w:val="single" w:sz="18" w:space="0" w:color="1F4E79"/>
+              <w:left w:val="single" w:sz="18" w:space="0" w:color="2C5282"/>
               <w:bottom w:val="single" w:sz="4" w:space="0" w:color="D3D3D3"/>
               <w:right w:val="single" w:sz="4" w:space="0" w:color="D3D3D3"/>
             </w:tcBorders>
@@ -5412,7 +5437,7 @@
         <w:rPr>
           <w:b/>
           <w:i/>
-          <w:color w:val="595959"/>
+          <w:color w:val="2D3748"/>
           <w:sz w:val="22"/>
         </w:rPr>
         <w:t>B. Cấu hình các biến môi trường trong file `.env`</w:t>
@@ -5421,6 +5446,7 @@
     <w:p>
       <w:pPr>
         <w:spacing w:after="120" w:before="0" w:line="276" w:lineRule="auto"/>
+        <w:jc w:val="both"/>
       </w:pPr>
       <w:r>
         <w:t xml:space="preserve">Tạo file </w:t>
@@ -5459,7 +5485,7 @@
             </w:tcMar>
             <w:tcBorders>
               <w:top w:val="single" w:sz="4" w:space="0" w:color="D3D3D3"/>
-              <w:left w:val="single" w:sz="18" w:space="0" w:color="1F4E79"/>
+              <w:left w:val="single" w:sz="18" w:space="0" w:color="2C5282"/>
               <w:bottom w:val="single" w:sz="4" w:space="0" w:color="D3D3D3"/>
               <w:right w:val="single" w:sz="4" w:space="0" w:color="D3D3D3"/>
             </w:tcBorders>
@@ -5518,7 +5544,7 @@
         <w:rPr>
           <w:b/>
           <w:i/>
-          <w:color w:val="595959"/>
+          <w:color w:val="2D3748"/>
           <w:sz w:val="22"/>
         </w:rPr>
         <w:t>C. Quy trình vận hành và chạy dịch vụ ngầm (Systemd Service)</w:t>
@@ -5527,6 +5553,7 @@
     <w:p>
       <w:pPr>
         <w:spacing w:after="120" w:before="0" w:line="276" w:lineRule="auto"/>
+        <w:jc w:val="both"/>
       </w:pPr>
       <w:r>
         <w:t>Hệ thống được thiết kế để tự động vận hành khi thiết bị biên Jetson được cắm nguồn điện.</w:t>
@@ -5535,7 +5562,7 @@
     <w:p>
       <w:pPr>
         <w:pStyle w:val="ListNumber"/>
-        <w:spacing w:after="60" w:before="0"/>
+        <w:spacing w:after="60" w:before="0" w:line="276" w:lineRule="auto"/>
         <w:ind w:left="360"/>
       </w:pPr>
       <w:r>
@@ -5548,6 +5575,7 @@
     <w:p>
       <w:pPr>
         <w:spacing w:after="120" w:before="0" w:line="276" w:lineRule="auto"/>
+        <w:jc w:val="both"/>
       </w:pPr>
       <w:r>
         <w:t xml:space="preserve">Hệ thống cung cấp sẵn script bash </w:t>
@@ -5586,7 +5614,7 @@
             </w:tcMar>
             <w:tcBorders>
               <w:top w:val="single" w:sz="4" w:space="0" w:color="D3D3D3"/>
-              <w:left w:val="single" w:sz="18" w:space="0" w:color="1F4E79"/>
+              <w:left w:val="single" w:sz="18" w:space="0" w:color="2C5282"/>
               <w:bottom w:val="single" w:sz="4" w:space="0" w:color="D3D3D3"/>
               <w:right w:val="single" w:sz="4" w:space="0" w:color="D3D3D3"/>
             </w:tcBorders>
@@ -5617,6 +5645,7 @@
     <w:p>
       <w:pPr>
         <w:spacing w:after="120" w:before="0" w:line="276" w:lineRule="auto"/>
+        <w:jc w:val="both"/>
       </w:pPr>
       <w:r>
         <w:t xml:space="preserve">Script này sẽ tự động tạo file dịch vụ </w:t>
@@ -5636,7 +5665,7 @@
     <w:p>
       <w:pPr>
         <w:pStyle w:val="ListNumber"/>
-        <w:spacing w:after="60" w:before="0"/>
+        <w:spacing w:after="60" w:before="0" w:line="276" w:lineRule="auto"/>
         <w:ind w:left="360"/>
       </w:pPr>
       <w:r>
@@ -5649,7 +5678,7 @@
     <w:p>
       <w:pPr>
         <w:pStyle w:val="ListBullet"/>
-        <w:spacing w:after="60" w:before="0"/>
+        <w:spacing w:after="60" w:before="0" w:line="276" w:lineRule="auto"/>
         <w:ind w:left="720"/>
       </w:pPr>
       <w:r>
@@ -5681,7 +5710,7 @@
             </w:tcMar>
             <w:tcBorders>
               <w:top w:val="single" w:sz="4" w:space="0" w:color="D3D3D3"/>
-              <w:left w:val="single" w:sz="18" w:space="0" w:color="1F4E79"/>
+              <w:left w:val="single" w:sz="18" w:space="0" w:color="2C5282"/>
               <w:bottom w:val="single" w:sz="4" w:space="0" w:color="D3D3D3"/>
               <w:right w:val="single" w:sz="4" w:space="0" w:color="D3D3D3"/>
             </w:tcBorders>
@@ -5710,7 +5739,7 @@
     <w:p>
       <w:pPr>
         <w:pStyle w:val="ListBullet"/>
-        <w:spacing w:after="60" w:before="0"/>
+        <w:spacing w:after="60" w:before="0" w:line="276" w:lineRule="auto"/>
         <w:ind w:left="720"/>
       </w:pPr>
       <w:r>
@@ -5742,7 +5771,7 @@
             </w:tcMar>
             <w:tcBorders>
               <w:top w:val="single" w:sz="4" w:space="0" w:color="D3D3D3"/>
-              <w:left w:val="single" w:sz="18" w:space="0" w:color="1F4E79"/>
+              <w:left w:val="single" w:sz="18" w:space="0" w:color="2C5282"/>
               <w:bottom w:val="single" w:sz="4" w:space="0" w:color="D3D3D3"/>
               <w:right w:val="single" w:sz="4" w:space="0" w:color="D3D3D3"/>
             </w:tcBorders>
@@ -5771,7 +5800,7 @@
     <w:p>
       <w:pPr>
         <w:pStyle w:val="ListBullet"/>
-        <w:spacing w:after="60" w:before="0"/>
+        <w:spacing w:after="60" w:before="0" w:line="276" w:lineRule="auto"/>
         <w:ind w:left="720"/>
       </w:pPr>
       <w:r>
@@ -5803,7 +5832,7 @@
             </w:tcMar>
             <w:tcBorders>
               <w:top w:val="single" w:sz="4" w:space="0" w:color="D3D3D3"/>
-              <w:left w:val="single" w:sz="18" w:space="0" w:color="1F4E79"/>
+              <w:left w:val="single" w:sz="18" w:space="0" w:color="2C5282"/>
               <w:bottom w:val="single" w:sz="4" w:space="0" w:color="D3D3D3"/>
               <w:right w:val="single" w:sz="4" w:space="0" w:color="D3D3D3"/>
             </w:tcBorders>
@@ -5832,7 +5861,7 @@
     <w:p>
       <w:pPr>
         <w:pStyle w:val="ListBullet"/>
-        <w:spacing w:after="60" w:before="0"/>
+        <w:spacing w:after="60" w:before="0" w:line="276" w:lineRule="auto"/>
         <w:ind w:left="720"/>
       </w:pPr>
       <w:r>
@@ -5864,7 +5893,7 @@
             </w:tcMar>
             <w:tcBorders>
               <w:top w:val="single" w:sz="4" w:space="0" w:color="D3D3D3"/>
-              <w:left w:val="single" w:sz="18" w:space="0" w:color="1F4E79"/>
+              <w:left w:val="single" w:sz="18" w:space="0" w:color="2C5282"/>
               <w:bottom w:val="single" w:sz="4" w:space="0" w:color="D3D3D3"/>
               <w:right w:val="single" w:sz="4" w:space="0" w:color="D3D3D3"/>
             </w:tcBorders>
@@ -5893,7 +5922,7 @@
     <w:p>
       <w:pPr>
         <w:pStyle w:val="ListBullet"/>
-        <w:spacing w:after="60" w:before="0"/>
+        <w:spacing w:after="60" w:before="0" w:line="276" w:lineRule="auto"/>
         <w:ind w:left="720"/>
       </w:pPr>
       <w:r>
@@ -5925,7 +5954,7 @@
             </w:tcMar>
             <w:tcBorders>
               <w:top w:val="single" w:sz="4" w:space="0" w:color="D3D3D3"/>
-              <w:left w:val="single" w:sz="18" w:space="0" w:color="1F4E79"/>
+              <w:left w:val="single" w:sz="18" w:space="0" w:color="2C5282"/>
               <w:bottom w:val="single" w:sz="4" w:space="0" w:color="D3D3D3"/>
               <w:right w:val="single" w:sz="4" w:space="0" w:color="D3D3D3"/>
             </w:tcBorders>
@@ -5960,7 +5989,7 @@
         <w:rPr>
           <w:b/>
           <w:i/>
-          <w:color w:val="595959"/>
+          <w:color w:val="2D3748"/>
           <w:sz w:val="22"/>
         </w:rPr>
         <w:t>D. Hướng dẫn xử lý sự cố nhanh (Troubleshooting Guide)</w:t>
@@ -5969,7 +5998,7 @@
     <w:p>
       <w:pPr>
         <w:pStyle w:val="ListNumber"/>
-        <w:spacing w:after="60" w:before="0"/>
+        <w:spacing w:after="60" w:before="0" w:line="276" w:lineRule="auto"/>
         <w:ind w:left="360"/>
       </w:pPr>
       <w:r>
@@ -5982,7 +6011,7 @@
     <w:p>
       <w:pPr>
         <w:pStyle w:val="ListBullet"/>
-        <w:spacing w:after="60" w:before="0"/>
+        <w:spacing w:after="60" w:before="0" w:line="276" w:lineRule="auto"/>
         <w:ind w:left="720"/>
       </w:pPr>
       <w:r>
@@ -6009,7 +6038,7 @@
     <w:p>
       <w:pPr>
         <w:pStyle w:val="ListBullet"/>
-        <w:spacing w:after="60" w:before="0"/>
+        <w:spacing w:after="60" w:before="0" w:line="276" w:lineRule="auto"/>
         <w:ind w:left="720"/>
       </w:pPr>
       <w:r>
@@ -6047,7 +6076,7 @@
     <w:p>
       <w:pPr>
         <w:pStyle w:val="ListNumber"/>
-        <w:spacing w:after="60" w:before="0"/>
+        <w:spacing w:after="60" w:before="0" w:line="276" w:lineRule="auto"/>
         <w:ind w:left="360"/>
       </w:pPr>
       <w:r>
@@ -6060,7 +6089,7 @@
     <w:p>
       <w:pPr>
         <w:pStyle w:val="ListBullet"/>
-        <w:spacing w:after="60" w:before="0"/>
+        <w:spacing w:after="60" w:before="0" w:line="276" w:lineRule="auto"/>
         <w:ind w:left="720"/>
       </w:pPr>
       <w:r>
@@ -6084,7 +6113,7 @@
     <w:p>
       <w:pPr>
         <w:pStyle w:val="ListBullet"/>
-        <w:spacing w:after="60" w:before="0"/>
+        <w:spacing w:after="60" w:before="0" w:line="276" w:lineRule="auto"/>
         <w:ind w:left="720"/>
       </w:pPr>
       <w:r>
@@ -6111,7 +6140,7 @@
     <w:p>
       <w:pPr>
         <w:pStyle w:val="ListBullet"/>
-        <w:spacing w:after="60" w:before="0"/>
+        <w:spacing w:after="60" w:before="0" w:line="276" w:lineRule="auto"/>
         <w:ind w:left="720"/>
       </w:pPr>
       <w:r>
@@ -6168,7 +6197,7 @@
             </w:tcMar>
             <w:tcBorders>
               <w:top w:val="single" w:sz="4" w:space="0" w:color="D3D3D3"/>
-              <w:left w:val="single" w:sz="18" w:space="0" w:color="1F4E79"/>
+              <w:left w:val="single" w:sz="18" w:space="0" w:color="2C5282"/>
               <w:bottom w:val="single" w:sz="4" w:space="0" w:color="D3D3D3"/>
               <w:right w:val="single" w:sz="4" w:space="0" w:color="D3D3D3"/>
             </w:tcBorders>
@@ -6197,6 +6226,7 @@
     <w:p>
       <w:pPr>
         <w:spacing w:after="120" w:before="0" w:line="276" w:lineRule="auto"/>
+        <w:jc w:val="both"/>
       </w:pPr>
       <w:r>
         <w:t xml:space="preserve">Sau đó cập nhật đường dẫn </w:t>
@@ -6597,9 +6627,13 @@
     <w:name w:val="Normal"/>
     <w:qFormat/>
     <w:rsid w:val="00FC693F"/>
+    <w:pPr>
+      <w:spacing w:line="276" w:lineRule="auto"/>
+      <w:jc w:val="both"/>
+    </w:pPr>
     <w:rPr>
-      <w:rFonts w:ascii="Times New Roman" w:hAnsi="Times New Roman"/>
-      <w:color w:val="1E1E1E"/>
+      <w:rFonts w:ascii="Calibri" w:hAnsi="Calibri"/>
+      <w:color w:val="2D3748"/>
       <w:sz w:val="22"/>
     </w:rPr>
   </w:style>

</xml_diff>

<commit_message>
docs: remove author email from git commit log in technical documentation
</commit_message>
<xml_diff>
--- a/HOSO_KY_THUAT_DU_AN.docx
+++ b/HOSO_KY_THUAT_DU_AN.docx
@@ -2909,10 +2909,10 @@
         <w:rPr>
           <w:i/>
         </w:rPr>
-        <w:t>Tác giả:</w:t>
-      </w:r>
-      <w:r>
-        <w:t xml:space="preserve"> admin-khai &lt;admin-khai@example.com&gt;</w:t>
+        <w:t>Ngày thực hiện:</w:t>
+      </w:r>
+      <w:r>
+        <w:t xml:space="preserve"> Sat Jun 27 15:42:01 2026 +0700</w:t>
       </w:r>
     </w:p>
     <w:p>
@@ -2925,10 +2925,10 @@
         <w:rPr>
           <w:i/>
         </w:rPr>
-        <w:t>Ngày thực hiện:</w:t>
-      </w:r>
-      <w:r>
-        <w:t xml:space="preserve"> Sat Jun 27 15:42:01 2026 +0700</w:t>
+        <w:t>Tiêu đề:</w:t>
+      </w:r>
+      <w:r>
+        <w:t xml:space="preserve"> feat: cac chuc nang hoat dong tot - 15h41 27-06-2026</w:t>
       </w:r>
     </w:p>
     <w:p>
@@ -2941,10 +2941,34 @@
         <w:rPr>
           <w:i/>
         </w:rPr>
-        <w:t>Tiêu đề:</w:t>
-      </w:r>
-      <w:r>
-        <w:t xml:space="preserve"> feat: cac chuc nang hoat dong tot - 15h41 27-06-2026</w:t>
+        <w:t>Chi tiết:</w:t>
+      </w:r>
+      <w:r>
+        <w:t xml:space="preserve"> Đánh giá tổng thể hiệu năng của Edge Node khi chạy đồng hành hai luồng chính (YOLOv8 và Thermal Receiver). Thực hiện tối ưu hóa bộ nhớ GPU và dọn dẹp giải phóng VRAM.</w:t>
+      </w:r>
+    </w:p>
+    <w:p>
+      <w:pPr>
+        <w:pStyle w:val="ListBullet"/>
+        <w:spacing w:after="60" w:before="0" w:line="276" w:lineRule="auto"/>
+        <w:ind w:left="360"/>
+      </w:pPr>
+      <w:r>
+        <w:rPr>
+          <w:b/>
+        </w:rPr>
+        <w:t>Commit Hash:</w:t>
+      </w:r>
+      <w:r>
+        <w:t xml:space="preserve"> </w:t>
+      </w:r>
+      <w:r>
+        <w:rPr>
+          <w:rFonts w:ascii="Courier New" w:hAnsi="Courier New"/>
+          <w:color w:val="B43232"/>
+          <w:sz w:val="19"/>
+        </w:rPr>
+        <w:t>681afe3</w:t>
       </w:r>
     </w:p>
     <w:p>
@@ -2957,10 +2981,42 @@
         <w:rPr>
           <w:i/>
         </w:rPr>
+        <w:t>Ngày thực hiện:</w:t>
+      </w:r>
+      <w:r>
+        <w:t xml:space="preserve"> Sat Jun 13 17:11:56 2026 +0700</w:t>
+      </w:r>
+    </w:p>
+    <w:p>
+      <w:pPr>
+        <w:pStyle w:val="ListBullet"/>
+        <w:spacing w:after="60" w:before="0" w:line="276" w:lineRule="auto"/>
+        <w:ind w:left="720"/>
+      </w:pPr>
+      <w:r>
+        <w:rPr>
+          <w:i/>
+        </w:rPr>
+        <w:t>Tiêu đề:</w:t>
+      </w:r>
+      <w:r>
+        <w:t xml:space="preserve"> fix: resolve scaler shape mismatch in autotrain and improve yolo rtsp connection stability</w:t>
+      </w:r>
+    </w:p>
+    <w:p>
+      <w:pPr>
+        <w:pStyle w:val="ListBullet"/>
+        <w:spacing w:after="60" w:before="0" w:line="276" w:lineRule="auto"/>
+        <w:ind w:left="720"/>
+      </w:pPr>
+      <w:r>
+        <w:rPr>
+          <w:i/>
+        </w:rPr>
         <w:t>Chi tiết:</w:t>
       </w:r>
       <w:r>
-        <w:t xml:space="preserve"> Đánh giá tổng thể hiệu năng của Edge Node khi chạy đồng hành hai luồng chính (YOLOv8 và Thermal Receiver). Thực hiện tối ưu hóa bộ nhớ GPU và dọn dẹp giải phóng VRAM.</w:t>
+        <w:t xml:space="preserve"> Sửa lỗi bất tương thích kích thước bộ chuẩn hóa (shape mismatch) khi số lượng target nhiệt độ thay đổi trong tiến trình tự huấn luyện. Tối ưu hóa luồng đọc camera RTSP của YOLOv8 tránh timeout đứt mạng.</w:t>
       </w:r>
     </w:p>
     <w:p>
@@ -2984,7 +3040,7 @@
           <w:color w:val="B43232"/>
           <w:sz w:val="19"/>
         </w:rPr>
-        <w:t>681afe3</w:t>
+        <w:t>df1c7e2</w:t>
       </w:r>
     </w:p>
     <w:p>
@@ -2997,10 +3053,10 @@
         <w:rPr>
           <w:i/>
         </w:rPr>
-        <w:t>Tác giả:</w:t>
-      </w:r>
-      <w:r>
-        <w:t xml:space="preserve"> admin-khai &lt;admin-khai@example.com&gt;</w:t>
+        <w:t>Ngày thực hiện:</w:t>
+      </w:r>
+      <w:r>
+        <w:t xml:space="preserve"> Tue Jun 9 15:40:46 2026 +0700</w:t>
       </w:r>
     </w:p>
     <w:p>
@@ -3013,10 +3069,10 @@
         <w:rPr>
           <w:i/>
         </w:rPr>
-        <w:t>Ngày thực hiện:</w:t>
-      </w:r>
-      <w:r>
-        <w:t xml:space="preserve"> Sat Jun 13 17:11:56 2026 +0700</w:t>
+        <w:t>Tiêu đề:</w:t>
+      </w:r>
+      <w:r>
+        <w:t xml:space="preserve"> chore: add trained models, scalers, and configs to repository</w:t>
       </w:r>
     </w:p>
     <w:p>
@@ -3029,10 +3085,67 @@
         <w:rPr>
           <w:i/>
         </w:rPr>
-        <w:t>Tiêu đề:</w:t>
-      </w:r>
-      <w:r>
-        <w:t xml:space="preserve"> fix: resolve scaler shape mismatch in autotrain and improve yolo rtsp connection stability</w:t>
+        <w:t>Chi tiết:</w:t>
+      </w:r>
+      <w:r>
+        <w:t xml:space="preserve"> Lưu trữ các tệp trọng số đã huấn luyện (</w:t>
+      </w:r>
+      <w:r>
+        <w:rPr>
+          <w:rFonts w:ascii="Courier New" w:hAnsi="Courier New"/>
+          <w:color w:val="B43232"/>
+          <w:sz w:val="19"/>
+        </w:rPr>
+        <w:t>mtkan_weights.weights.h5</w:t>
+      </w:r>
+      <w:r>
+        <w:t>), bộ chuẩn hóa dữ liệu (</w:t>
+      </w:r>
+      <w:r>
+        <w:rPr>
+          <w:rFonts w:ascii="Courier New" w:hAnsi="Courier New"/>
+          <w:color w:val="B43232"/>
+          <w:sz w:val="19"/>
+        </w:rPr>
+        <w:t>scaler_X.pkl</w:t>
+      </w:r>
+      <w:r>
+        <w:t xml:space="preserve">, </w:t>
+      </w:r>
+      <w:r>
+        <w:rPr>
+          <w:rFonts w:ascii="Courier New" w:hAnsi="Courier New"/>
+          <w:color w:val="B43232"/>
+          <w:sz w:val="19"/>
+        </w:rPr>
+        <w:t>scaler_y.pkl</w:t>
+      </w:r>
+      <w:r>
+        <w:t>) và file cấu hình camera mặc định vào repository.</w:t>
+      </w:r>
+    </w:p>
+    <w:p>
+      <w:pPr>
+        <w:pStyle w:val="ListBullet"/>
+        <w:spacing w:after="60" w:before="0" w:line="276" w:lineRule="auto"/>
+        <w:ind w:left="360"/>
+      </w:pPr>
+      <w:r>
+        <w:rPr>
+          <w:b/>
+        </w:rPr>
+        <w:t>Commit Hash:</w:t>
+      </w:r>
+      <w:r>
+        <w:t xml:space="preserve"> </w:t>
+      </w:r>
+      <w:r>
+        <w:rPr>
+          <w:rFonts w:ascii="Courier New" w:hAnsi="Courier New"/>
+          <w:color w:val="B43232"/>
+          <w:sz w:val="19"/>
+        </w:rPr>
+        <w:t>4a3aafa</w:t>
       </w:r>
     </w:p>
     <w:p>
@@ -3045,10 +3158,75 @@
         <w:rPr>
           <w:i/>
         </w:rPr>
+        <w:t>Ngày thực hiện:</w:t>
+      </w:r>
+      <w:r>
+        <w:t xml:space="preserve"> Tue Jun 9 15:35:41 2026 +0700</w:t>
+      </w:r>
+    </w:p>
+    <w:p>
+      <w:pPr>
+        <w:pStyle w:val="ListBullet"/>
+        <w:spacing w:after="60" w:before="0" w:line="276" w:lineRule="auto"/>
+        <w:ind w:left="720"/>
+      </w:pPr>
+      <w:r>
+        <w:rPr>
+          <w:i/>
+        </w:rPr>
+        <w:t>Tiêu đề:</w:t>
+      </w:r>
+      <w:r>
+        <w:t xml:space="preserve"> chore: add log files and telemetry data history to repository</w:t>
+      </w:r>
+    </w:p>
+    <w:p>
+      <w:pPr>
+        <w:pStyle w:val="ListBullet"/>
+        <w:spacing w:after="60" w:before="0" w:line="276" w:lineRule="auto"/>
+        <w:ind w:left="720"/>
+      </w:pPr>
+      <w:r>
+        <w:rPr>
+          <w:i/>
+        </w:rPr>
         <w:t>Chi tiết:</w:t>
       </w:r>
       <w:r>
-        <w:t xml:space="preserve"> Sửa lỗi bất tương thích kích thước bộ chuẩn hóa (shape mismatch) khi số lượng target nhiệt độ thay đổi trong tiến trình tự huấn luyện. Tối ưu hóa luồng đọc camera RTSP của YOLOv8 tránh timeout đứt mạng.</w:t>
+        <w:t xml:space="preserve"> Đưa các file ghi nhật ký hoạt động (</w:t>
+      </w:r>
+      <w:r>
+        <w:rPr>
+          <w:rFonts w:ascii="Courier New" w:hAnsi="Courier New"/>
+          <w:color w:val="B43232"/>
+          <w:sz w:val="19"/>
+        </w:rPr>
+        <w:t>thermal_service.log</w:t>
+      </w:r>
+      <w:r>
+        <w:t xml:space="preserve">, </w:t>
+      </w:r>
+      <w:r>
+        <w:rPr>
+          <w:rFonts w:ascii="Courier New" w:hAnsi="Courier New"/>
+          <w:color w:val="B43232"/>
+          <w:sz w:val="19"/>
+        </w:rPr>
+        <w:t>thermal_sender.log</w:t>
+      </w:r>
+      <w:r>
+        <w:t xml:space="preserve">, </w:t>
+      </w:r>
+      <w:r>
+        <w:rPr>
+          <w:rFonts w:ascii="Courier New" w:hAnsi="Courier New"/>
+          <w:color w:val="B43232"/>
+          <w:sz w:val="19"/>
+        </w:rPr>
+        <w:t>system_all.log</w:t>
+      </w:r>
+      <w:r>
+        <w:t>) và dữ liệu thực tế trạm biến áp vào Git để kiểm tra offline.</w:t>
       </w:r>
     </w:p>
     <w:p>
@@ -3072,7 +3250,7 @@
           <w:color w:val="B43232"/>
           <w:sz w:val="19"/>
         </w:rPr>
-        <w:t>df1c7e2</w:t>
+        <w:t>4e5c407</w:t>
       </w:r>
     </w:p>
     <w:p>
@@ -3085,10 +3263,10 @@
         <w:rPr>
           <w:i/>
         </w:rPr>
-        <w:t>Tác giả:</w:t>
-      </w:r>
-      <w:r>
-        <w:t xml:space="preserve"> admin-khai &lt;admin-khai@example.com&gt;</w:t>
+        <w:t>Ngày thực hiện:</w:t>
+      </w:r>
+      <w:r>
+        <w:t xml:space="preserve"> Tue Jun 9 11:48:54 2026 +0700</w:t>
       </w:r>
     </w:p>
     <w:p>
@@ -3101,10 +3279,10 @@
         <w:rPr>
           <w:i/>
         </w:rPr>
-        <w:t>Ngày thực hiện:</w:t>
-      </w:r>
-      <w:r>
-        <w:t xml:space="preserve"> Tue Jun 9 15:40:46 2026 +0700</w:t>
+        <w:t>Tiêu đề:</w:t>
+      </w:r>
+      <w:r>
+        <w:t xml:space="preserve"> feat: resolve callback url dynamically based on requesting client IP</w:t>
       </w:r>
     </w:p>
     <w:p>
@@ -3117,10 +3295,34 @@
         <w:rPr>
           <w:i/>
         </w:rPr>
-        <w:t>Tiêu đề:</w:t>
-      </w:r>
-      <w:r>
-        <w:t xml:space="preserve"> chore: add trained models, scalers, and configs to repository</w:t>
+        <w:t>Chi tiết:</w:t>
+      </w:r>
+      <w:r>
+        <w:t xml:space="preserve"> Phát triển logic tự động phân tích và giải quyết IP động của Central Station gửi yêu cầu để định tuyến URL callback phản hồi kết quả dự báo một cách linh hoạt.</w:t>
+      </w:r>
+    </w:p>
+    <w:p>
+      <w:pPr>
+        <w:pStyle w:val="ListBullet"/>
+        <w:spacing w:after="60" w:before="0" w:line="276" w:lineRule="auto"/>
+        <w:ind w:left="360"/>
+      </w:pPr>
+      <w:r>
+        <w:rPr>
+          <w:b/>
+        </w:rPr>
+        <w:t>Commit Hash:</w:t>
+      </w:r>
+      <w:r>
+        <w:t xml:space="preserve"> </w:t>
+      </w:r>
+      <w:r>
+        <w:rPr>
+          <w:rFonts w:ascii="Courier New" w:hAnsi="Courier New"/>
+          <w:color w:val="B43232"/>
+          <w:sz w:val="19"/>
+        </w:rPr>
+        <w:t>67c51f6</w:t>
       </w:r>
     </w:p>
     <w:p>
@@ -3133,10 +3335,58 @@
         <w:rPr>
           <w:i/>
         </w:rPr>
+        <w:t>Ngày thực hiện:</w:t>
+      </w:r>
+      <w:r>
+        <w:t xml:space="preserve"> Mon Jun 8 13:46:08 2026 +0700</w:t>
+      </w:r>
+    </w:p>
+    <w:p>
+      <w:pPr>
+        <w:pStyle w:val="ListBullet"/>
+        <w:spacing w:after="60" w:before="0" w:line="276" w:lineRule="auto"/>
+        <w:ind w:left="720"/>
+      </w:pPr>
+      <w:r>
+        <w:rPr>
+          <w:i/>
+        </w:rPr>
+        <w:t>Tiêu đề:</w:t>
+      </w:r>
+      <w:r>
+        <w:t xml:space="preserve"> feat: partition raw json packet logs into camera-specific subdirectories under received_data/</w:t>
+      </w:r>
+    </w:p>
+    <w:p>
+      <w:pPr>
+        <w:pStyle w:val="ListBullet"/>
+        <w:spacing w:after="60" w:before="0" w:line="276" w:lineRule="auto"/>
+        <w:ind w:left="720"/>
+      </w:pPr>
+      <w:r>
+        <w:rPr>
+          <w:i/>
+        </w:rPr>
         <w:t>Chi tiết:</w:t>
       </w:r>
       <w:r>
-        <w:t xml:space="preserve"> Lưu trữ các tệp trọng số đã huấn luyện (</w:t>
+        <w:t xml:space="preserve"> Tách biệt lưu trữ log thô JSON của từng camera nhiệt theo địa chỉ IP vào các thư mục con riêng biệt để tránh ghi đè dữ liệu.</w:t>
+      </w:r>
+    </w:p>
+    <w:p>
+      <w:pPr>
+        <w:pStyle w:val="ListBullet"/>
+        <w:spacing w:after="60" w:before="0" w:line="276" w:lineRule="auto"/>
+        <w:ind w:left="360"/>
+      </w:pPr>
+      <w:r>
+        <w:rPr>
+          <w:b/>
+        </w:rPr>
+        <w:t>Commit Hash:</w:t>
+      </w:r>
+      <w:r>
+        <w:t xml:space="preserve"> </w:t>
       </w:r>
       <w:r>
         <w:rPr>
@@ -3144,10 +3394,71 @@
           <w:color w:val="B43232"/>
           <w:sz w:val="19"/>
         </w:rPr>
-        <w:t>mtkan_weights.weights.h5</w:t>
-      </w:r>
-      <w:r>
-        <w:t>), bộ chuẩn hóa dữ liệu (</w:t>
+        <w:t>d8505be</w:t>
+      </w:r>
+    </w:p>
+    <w:p>
+      <w:pPr>
+        <w:pStyle w:val="ListBullet"/>
+        <w:spacing w:after="60" w:before="0" w:line="276" w:lineRule="auto"/>
+        <w:ind w:left="720"/>
+      </w:pPr>
+      <w:r>
+        <w:rPr>
+          <w:i/>
+        </w:rPr>
+        <w:t>Ngày thực hiện:</w:t>
+      </w:r>
+      <w:r>
+        <w:t xml:space="preserve"> Mon Jun 8 13:41:48 2026 +0700</w:t>
+      </w:r>
+    </w:p>
+    <w:p>
+      <w:pPr>
+        <w:pStyle w:val="ListBullet"/>
+        <w:spacing w:after="60" w:before="0" w:line="276" w:lineRule="auto"/>
+        <w:ind w:left="720"/>
+      </w:pPr>
+      <w:r>
+        <w:rPr>
+          <w:i/>
+        </w:rPr>
+        <w:t>Tiêu đề:</w:t>
+      </w:r>
+      <w:r>
+        <w:t xml:space="preserve"> feat: implement per-camera partitioning for data, configurations, model weights, and scalers</w:t>
+      </w:r>
+    </w:p>
+    <w:p>
+      <w:pPr>
+        <w:pStyle w:val="ListBullet"/>
+        <w:spacing w:after="60" w:before="0" w:line="276" w:lineRule="auto"/>
+        <w:ind w:left="720"/>
+      </w:pPr>
+      <w:r>
+        <w:rPr>
+          <w:i/>
+        </w:rPr>
+        <w:t>Chi tiết:</w:t>
+      </w:r>
+      <w:r>
+        <w:t xml:space="preserve"> Thiết lập cơ chế đa camera (multi-camera partitioning) độc lập cho toàn bộ tài nguyên: file lịch sử CSV, file cấu hình, scaler và trọng số mô hình.</w:t>
+      </w:r>
+    </w:p>
+    <w:p>
+      <w:pPr>
+        <w:pStyle w:val="ListBullet"/>
+        <w:spacing w:after="60" w:before="0" w:line="276" w:lineRule="auto"/>
+        <w:ind w:left="360"/>
+      </w:pPr>
+      <w:r>
+        <w:rPr>
+          <w:b/>
+        </w:rPr>
+        <w:t>Commit Hash:</w:t>
+      </w:r>
+      <w:r>
+        <w:t xml:space="preserve"> </w:t>
       </w:r>
       <w:r>
         <w:rPr>
@@ -3155,10 +3466,71 @@
           <w:color w:val="B43232"/>
           <w:sz w:val="19"/>
         </w:rPr>
-        <w:t>scaler_X.pkl</w:t>
-      </w:r>
-      <w:r>
-        <w:t xml:space="preserve">, </w:t>
+        <w:t>9c68d66</w:t>
+      </w:r>
+    </w:p>
+    <w:p>
+      <w:pPr>
+        <w:pStyle w:val="ListBullet"/>
+        <w:spacing w:after="60" w:before="0" w:line="276" w:lineRule="auto"/>
+        <w:ind w:left="720"/>
+      </w:pPr>
+      <w:r>
+        <w:rPr>
+          <w:i/>
+        </w:rPr>
+        <w:t>Ngày thực hiện:</w:t>
+      </w:r>
+      <w:r>
+        <w:t xml:space="preserve"> Mon Jun 8 08:39:40 2026 +0700</w:t>
+      </w:r>
+    </w:p>
+    <w:p>
+      <w:pPr>
+        <w:pStyle w:val="ListBullet"/>
+        <w:spacing w:after="60" w:before="0" w:line="276" w:lineRule="auto"/>
+        <w:ind w:left="720"/>
+      </w:pPr>
+      <w:r>
+        <w:rPr>
+          <w:i/>
+        </w:rPr>
+        <w:t>Tiêu đề:</w:t>
+      </w:r>
+      <w:r>
+        <w:t xml:space="preserve"> fix: resolve exploding predictions and add camera auto-reconnect</w:t>
+      </w:r>
+    </w:p>
+    <w:p>
+      <w:pPr>
+        <w:pStyle w:val="ListBullet"/>
+        <w:spacing w:after="60" w:before="0" w:line="276" w:lineRule="auto"/>
+        <w:ind w:left="720"/>
+      </w:pPr>
+      <w:r>
+        <w:rPr>
+          <w:i/>
+        </w:rPr>
+        <w:t>Chi tiết:</w:t>
+      </w:r>
+      <w:r>
+        <w:t xml:space="preserve"> Sửa lỗi bùng nổ giá trị dự báo nhiệt độ do khuyết dữ liệu thông qua bộ nội suy thời gian. Tích hợp tính năng tự động kết nối lại camera khi đứt luồng RTSP.</w:t>
+      </w:r>
+    </w:p>
+    <w:p>
+      <w:pPr>
+        <w:pStyle w:val="ListBullet"/>
+        <w:spacing w:after="60" w:before="0" w:line="276" w:lineRule="auto"/>
+        <w:ind w:left="360"/>
+      </w:pPr>
+      <w:r>
+        <w:rPr>
+          <w:b/>
+        </w:rPr>
+        <w:t>Commit Hash:</w:t>
+      </w:r>
+      <w:r>
+        <w:t xml:space="preserve"> </w:t>
       </w:r>
       <w:r>
         <w:rPr>
@@ -3166,10 +3538,66 @@
           <w:color w:val="B43232"/>
           <w:sz w:val="19"/>
         </w:rPr>
-        <w:t>scaler_y.pkl</w:t>
-      </w:r>
-      <w:r>
-        <w:t>) và file cấu hình camera mặc định vào repository.</w:t>
+        <w:t>5620f4c</w:t>
+      </w:r>
+    </w:p>
+    <w:p>
+      <w:pPr>
+        <w:pStyle w:val="ListBullet"/>
+        <w:spacing w:after="60" w:before="0" w:line="276" w:lineRule="auto"/>
+        <w:ind w:left="720"/>
+      </w:pPr>
+      <w:r>
+        <w:rPr>
+          <w:i/>
+        </w:rPr>
+        <w:t>Ngày thực hiện:</w:t>
+      </w:r>
+      <w:r>
+        <w:t xml:space="preserve"> Thu Jun 4 13:37:12 2026 +0700</w:t>
+      </w:r>
+    </w:p>
+    <w:p>
+      <w:pPr>
+        <w:pStyle w:val="ListBullet"/>
+        <w:spacing w:after="60" w:before="0" w:line="276" w:lineRule="auto"/>
+        <w:ind w:left="720"/>
+      </w:pPr>
+      <w:r>
+        <w:rPr>
+          <w:i/>
+        </w:rPr>
+        <w:t>Tiêu đề:</w:t>
+      </w:r>
+      <w:r>
+        <w:t xml:space="preserve"> chore: update targets list configuration</w:t>
+      </w:r>
+    </w:p>
+    <w:p>
+      <w:pPr>
+        <w:pStyle w:val="ListBullet"/>
+        <w:spacing w:after="60" w:before="0" w:line="276" w:lineRule="auto"/>
+        <w:ind w:left="720"/>
+      </w:pPr>
+      <w:r>
+        <w:rPr>
+          <w:i/>
+        </w:rPr>
+        <w:t>Chi tiết:</w:t>
+      </w:r>
+      <w:r>
+        <w:t xml:space="preserve"> Cập nhật danh sách điểm đo nhiệt độ cần giám sát (</w:t>
+      </w:r>
+      <w:r>
+        <w:rPr>
+          <w:rFonts w:ascii="Courier New" w:hAnsi="Courier New"/>
+          <w:color w:val="B43232"/>
+          <w:sz w:val="19"/>
+        </w:rPr>
+        <w:t>targets</w:t>
+      </w:r>
+      <w:r>
+        <w:t>) cho các trạm biến áp.</w:t>
       </w:r>
     </w:p>
     <w:p>
@@ -3193,7 +3621,7 @@
           <w:color w:val="B43232"/>
           <w:sz w:val="19"/>
         </w:rPr>
-        <w:t>4a3aafa</w:t>
+        <w:t>77dba7d</w:t>
       </w:r>
     </w:p>
     <w:p>
@@ -3206,10 +3634,10 @@
         <w:rPr>
           <w:i/>
         </w:rPr>
-        <w:t>Tác giả:</w:t>
-      </w:r>
-      <w:r>
-        <w:t xml:space="preserve"> admin-khai &lt;admin-khai@example.com&gt;</w:t>
+        <w:t>Ngày thực hiện:</w:t>
+      </w:r>
+      <w:r>
+        <w:t xml:space="preserve"> Wed Jun 3 17:23:56 2026 +0700</w:t>
       </w:r>
     </w:p>
     <w:p>
@@ -3222,10 +3650,10 @@
         <w:rPr>
           <w:i/>
         </w:rPr>
-        <w:t>Ngày thực hiện:</w:t>
-      </w:r>
-      <w:r>
-        <w:t xml:space="preserve"> Tue Jun 9 15:35:41 2026 +0700</w:t>
+        <w:t>Tiêu đề:</w:t>
+      </w:r>
+      <w:r>
+        <w:t xml:space="preserve"> feat: stabilize thermal monitoring pipeline and implement instant alerting</w:t>
       </w:r>
     </w:p>
     <w:p>
@@ -3238,10 +3666,34 @@
         <w:rPr>
           <w:i/>
         </w:rPr>
-        <w:t>Tiêu đề:</w:t>
-      </w:r>
-      <w:r>
-        <w:t xml:space="preserve"> chore: add log files and telemetry data history to repository</w:t>
+        <w:t>Chi tiết:</w:t>
+      </w:r>
+      <w:r>
+        <w:t xml:space="preserve"> Tối ưu hóa đường ống thu thập và dự báo nhiệt độ, tích hợp cảnh báo người xâm nhập tức thời với bộ khóa trạng thái chống spam. Xử lý gộp gói tin đo nhiệt độ từ camera gửi lên trong vòng 5 giây và ngăn chặn ghi dòng trống vào CSV khi targets rỗng.</w:t>
+      </w:r>
+    </w:p>
+    <w:p>
+      <w:pPr>
+        <w:pStyle w:val="ListBullet"/>
+        <w:spacing w:after="60" w:before="0" w:line="276" w:lineRule="auto"/>
+        <w:ind w:left="360"/>
+      </w:pPr>
+      <w:r>
+        <w:rPr>
+          <w:b/>
+        </w:rPr>
+        <w:t>Commit Hash:</w:t>
+      </w:r>
+      <w:r>
+        <w:t xml:space="preserve"> </w:t>
+      </w:r>
+      <w:r>
+        <w:rPr>
+          <w:rFonts w:ascii="Courier New" w:hAnsi="Courier New"/>
+          <w:color w:val="B43232"/>
+          <w:sz w:val="19"/>
+        </w:rPr>
+        <w:t>e27c6e1</w:t>
       </w:r>
     </w:p>
     <w:p>
@@ -3254,10 +3706,58 @@
         <w:rPr>
           <w:i/>
         </w:rPr>
+        <w:t>Ngày thực hiện:</w:t>
+      </w:r>
+      <w:r>
+        <w:t xml:space="preserve"> Tue Jun 2 17:02:39 2026 +0700</w:t>
+      </w:r>
+    </w:p>
+    <w:p>
+      <w:pPr>
+        <w:pStyle w:val="ListBullet"/>
+        <w:spacing w:after="60" w:before="0" w:line="276" w:lineRule="auto"/>
+        <w:ind w:left="720"/>
+      </w:pPr>
+      <w:r>
+        <w:rPr>
+          <w:i/>
+        </w:rPr>
+        <w:t>Tiêu đề:</w:t>
+      </w:r>
+      <w:r>
+        <w:t xml:space="preserve"> Stabilize thermal forecasting, non-destructive CSV dynamic schema sync, and YOLOv8 event-based person detection MP4 recording with anti-flicker hybrid alerts</w:t>
+      </w:r>
+    </w:p>
+    <w:p>
+      <w:pPr>
+        <w:pStyle w:val="ListBullet"/>
+        <w:spacing w:after="60" w:before="0" w:line="276" w:lineRule="auto"/>
+        <w:ind w:left="720"/>
+      </w:pPr>
+      <w:r>
+        <w:rPr>
+          <w:i/>
+        </w:rPr>
         <w:t>Chi tiết:</w:t>
       </w:r>
       <w:r>
-        <w:t xml:space="preserve"> Đưa các file ghi nhật ký hoạt động (</w:t>
+        <w:t xml:space="preserve"> Bản cập nhật lớn ổn định tính năng dự báo nhiệt độ, cơ chế đồng bộ hóa schema CSV động không phá hủy cấu trúc cũ, ghi video sự kiện MP4 khi có người xâm nhập với bộ lọc chống rung giật.</w:t>
+      </w:r>
+    </w:p>
+    <w:p>
+      <w:pPr>
+        <w:pStyle w:val="ListBullet"/>
+        <w:spacing w:after="60" w:before="0" w:line="276" w:lineRule="auto"/>
+        <w:ind w:left="360"/>
+      </w:pPr>
+      <w:r>
+        <w:rPr>
+          <w:b/>
+        </w:rPr>
+        <w:t>Commit Hash:</w:t>
+      </w:r>
+      <w:r>
+        <w:t xml:space="preserve"> </w:t>
       </w:r>
       <w:r>
         <w:rPr>
@@ -3265,10 +3765,55 @@
           <w:color w:val="B43232"/>
           <w:sz w:val="19"/>
         </w:rPr>
-        <w:t>thermal_service.log</w:t>
-      </w:r>
-      <w:r>
-        <w:t xml:space="preserve">, </w:t>
+        <w:t>3378811</w:t>
+      </w:r>
+    </w:p>
+    <w:p>
+      <w:pPr>
+        <w:pStyle w:val="ListBullet"/>
+        <w:spacing w:after="60" w:before="0" w:line="276" w:lineRule="auto"/>
+        <w:ind w:left="720"/>
+      </w:pPr>
+      <w:r>
+        <w:rPr>
+          <w:i/>
+        </w:rPr>
+        <w:t>Ngày thực hiện:</w:t>
+      </w:r>
+      <w:r>
+        <w:t xml:space="preserve"> Sat May 30 17:56:54 2026 +0700</w:t>
+      </w:r>
+    </w:p>
+    <w:p>
+      <w:pPr>
+        <w:pStyle w:val="ListBullet"/>
+        <w:spacing w:after="60" w:before="0" w:line="276" w:lineRule="auto"/>
+        <w:ind w:left="720"/>
+      </w:pPr>
+      <w:r>
+        <w:rPr>
+          <w:i/>
+        </w:rPr>
+        <w:t>Tiêu đề:</w:t>
+      </w:r>
+      <w:r>
+        <w:t xml:space="preserve"> Update central server IP, uncomment YOLOv8, and add edge system script files</w:t>
+      </w:r>
+    </w:p>
+    <w:p>
+      <w:pPr>
+        <w:pStyle w:val="ListBullet"/>
+        <w:spacing w:after="60" w:before="0" w:line="276" w:lineRule="auto"/>
+        <w:ind w:left="720"/>
+      </w:pPr>
+      <w:r>
+        <w:rPr>
+          <w:i/>
+        </w:rPr>
+        <w:t>Chi tiết:</w:t>
+      </w:r>
+      <w:r>
+        <w:t xml:space="preserve"> Cập nhật địa chỉ IP máy chủ trung tâm thành </w:t>
       </w:r>
       <w:r>
         <w:rPr>
@@ -3276,10 +3821,10 @@
           <w:color w:val="B43232"/>
           <w:sz w:val="19"/>
         </w:rPr>
-        <w:t>thermal_sender.log</w:t>
-      </w:r>
-      <w:r>
-        <w:t xml:space="preserve">, </w:t>
+        <w:t>192.168.x.102</w:t>
+      </w:r>
+      <w:r>
+        <w:t>, kích hoạt chạy module YOLOv8 và bổ sung các file script điều hành biên (</w:t>
       </w:r>
       <w:r>
         <w:rPr>
@@ -3287,10 +3832,32 @@
           <w:color w:val="B43232"/>
           <w:sz w:val="19"/>
         </w:rPr>
-        <w:t>system_all.log</w:t>
-      </w:r>
-      <w:r>
-        <w:t>) và dữ liệu thực tế trạm biến áp vào Git để kiểm tra offline.</w:t>
+        <w:t>main_all.py</w:t>
+      </w:r>
+      <w:r>
+        <w:t xml:space="preserve">, </w:t>
+      </w:r>
+      <w:r>
+        <w:rPr>
+          <w:rFonts w:ascii="Courier New" w:hAnsi="Courier New"/>
+          <w:color w:val="B43232"/>
+          <w:sz w:val="19"/>
+        </w:rPr>
+        <w:t>yolo_detect.py</w:t>
+      </w:r>
+      <w:r>
+        <w:t xml:space="preserve">, </w:t>
+      </w:r>
+      <w:r>
+        <w:rPr>
+          <w:rFonts w:ascii="Courier New" w:hAnsi="Courier New"/>
+          <w:color w:val="B43232"/>
+          <w:sz w:val="19"/>
+        </w:rPr>
+        <w:t>thermal_sender.py</w:t>
+      </w:r>
+      <w:r>
+        <w:t>).</w:t>
       </w:r>
     </w:p>
     <w:p>
@@ -3314,7 +3881,7 @@
           <w:color w:val="B43232"/>
           <w:sz w:val="19"/>
         </w:rPr>
-        <w:t>4e5c407</w:t>
+        <w:t>db2c8c6</w:t>
       </w:r>
     </w:p>
     <w:p>
@@ -3327,10 +3894,10 @@
         <w:rPr>
           <w:i/>
         </w:rPr>
-        <w:t>Tác giả:</w:t>
-      </w:r>
-      <w:r>
-        <w:t xml:space="preserve"> admin-khai &lt;admin-khai@example.com&gt;</w:t>
+        <w:t>Ngày thực hiện:</w:t>
+      </w:r>
+      <w:r>
+        <w:t xml:space="preserve"> Thu Apr 23 08:18:50 2026 +0700</w:t>
       </w:r>
     </w:p>
     <w:p>
@@ -3343,10 +3910,10 @@
         <w:rPr>
           <w:i/>
         </w:rPr>
-        <w:t>Ngày thực hiện:</w:t>
-      </w:r>
-      <w:r>
-        <w:t xml:space="preserve"> Tue Jun 9 11:48:54 2026 +0700</w:t>
+        <w:t>Tiêu đề:</w:t>
+      </w:r>
+      <w:r>
+        <w:t xml:space="preserve"> Add .gitignore and remove pycache</w:t>
       </w:r>
     </w:p>
     <w:p>
@@ -3359,26 +3926,21 @@
         <w:rPr>
           <w:i/>
         </w:rPr>
-        <w:t>Tiêu đề:</w:t>
-      </w:r>
-      <w:r>
-        <w:t xml:space="preserve"> feat: resolve callback url dynamically based on requesting client IP</w:t>
-      </w:r>
-    </w:p>
-    <w:p>
-      <w:pPr>
-        <w:pStyle w:val="ListBullet"/>
-        <w:spacing w:after="60" w:before="0" w:line="276" w:lineRule="auto"/>
-        <w:ind w:left="720"/>
-      </w:pPr>
-      <w:r>
-        <w:rPr>
-          <w:i/>
-        </w:rPr>
         <w:t>Chi tiết:</w:t>
       </w:r>
       <w:r>
-        <w:t xml:space="preserve"> Phát triển logic tự động phân tích và giải quyết IP động của Central Station gửi yêu cầu để định tuyến URL callback phản hồi kết quả dự báo một cách linh hoạt.</w:t>
+        <w:t xml:space="preserve"> Thiết lập loại trừ file tạm, cache và các thư mục </w:t>
+      </w:r>
+      <w:r>
+        <w:rPr>
+          <w:rFonts w:ascii="Courier New" w:hAnsi="Courier New"/>
+          <w:color w:val="B43232"/>
+          <w:sz w:val="19"/>
+        </w:rPr>
+        <w:t>.pycache</w:t>
+      </w:r>
+      <w:r>
+        <w:t xml:space="preserve"> khỏi kho quản lý mã nguồn.</w:t>
       </w:r>
     </w:p>
     <w:p>
@@ -3402,793 +3964,7 @@
           <w:color w:val="B43232"/>
           <w:sz w:val="19"/>
         </w:rPr>
-        <w:t>67c51f6</w:t>
-      </w:r>
-    </w:p>
-    <w:p>
-      <w:pPr>
-        <w:pStyle w:val="ListBullet"/>
-        <w:spacing w:after="60" w:before="0" w:line="276" w:lineRule="auto"/>
-        <w:ind w:left="720"/>
-      </w:pPr>
-      <w:r>
-        <w:rPr>
-          <w:i/>
-        </w:rPr>
-        <w:t>Tác giả:</w:t>
-      </w:r>
-      <w:r>
-        <w:t xml:space="preserve"> admin-khai &lt;admin-khai@example.com&gt;</w:t>
-      </w:r>
-    </w:p>
-    <w:p>
-      <w:pPr>
-        <w:pStyle w:val="ListBullet"/>
-        <w:spacing w:after="60" w:before="0" w:line="276" w:lineRule="auto"/>
-        <w:ind w:left="720"/>
-      </w:pPr>
-      <w:r>
-        <w:rPr>
-          <w:i/>
-        </w:rPr>
-        <w:t>Ngày thực hiện:</w:t>
-      </w:r>
-      <w:r>
-        <w:t xml:space="preserve"> Mon Jun 8 13:46:08 2026 +0700</w:t>
-      </w:r>
-    </w:p>
-    <w:p>
-      <w:pPr>
-        <w:pStyle w:val="ListBullet"/>
-        <w:spacing w:after="60" w:before="0" w:line="276" w:lineRule="auto"/>
-        <w:ind w:left="720"/>
-      </w:pPr>
-      <w:r>
-        <w:rPr>
-          <w:i/>
-        </w:rPr>
-        <w:t>Tiêu đề:</w:t>
-      </w:r>
-      <w:r>
-        <w:t xml:space="preserve"> feat: partition raw json packet logs into camera-specific subdirectories under received_data/</w:t>
-      </w:r>
-    </w:p>
-    <w:p>
-      <w:pPr>
-        <w:pStyle w:val="ListBullet"/>
-        <w:spacing w:after="60" w:before="0" w:line="276" w:lineRule="auto"/>
-        <w:ind w:left="720"/>
-      </w:pPr>
-      <w:r>
-        <w:rPr>
-          <w:i/>
-        </w:rPr>
-        <w:t>Chi tiết:</w:t>
-      </w:r>
-      <w:r>
-        <w:t xml:space="preserve"> Tách biệt lưu trữ log thô JSON của từng camera nhiệt theo địa chỉ IP vào các thư mục con riêng biệt để tránh ghi đè dữ liệu.</w:t>
-      </w:r>
-    </w:p>
-    <w:p>
-      <w:pPr>
-        <w:pStyle w:val="ListBullet"/>
-        <w:spacing w:after="60" w:before="0" w:line="276" w:lineRule="auto"/>
-        <w:ind w:left="360"/>
-      </w:pPr>
-      <w:r>
-        <w:rPr>
-          <w:b/>
-        </w:rPr>
-        <w:t>Commit Hash:</w:t>
-      </w:r>
-      <w:r>
-        <w:t xml:space="preserve"> </w:t>
-      </w:r>
-      <w:r>
-        <w:rPr>
-          <w:rFonts w:ascii="Courier New" w:hAnsi="Courier New"/>
-          <w:color w:val="B43232"/>
-          <w:sz w:val="19"/>
-        </w:rPr>
-        <w:t>d8505be</w:t>
-      </w:r>
-    </w:p>
-    <w:p>
-      <w:pPr>
-        <w:pStyle w:val="ListBullet"/>
-        <w:spacing w:after="60" w:before="0" w:line="276" w:lineRule="auto"/>
-        <w:ind w:left="720"/>
-      </w:pPr>
-      <w:r>
-        <w:rPr>
-          <w:i/>
-        </w:rPr>
-        <w:t>Tác giả:</w:t>
-      </w:r>
-      <w:r>
-        <w:t xml:space="preserve"> admin-khai &lt;admin-khai@example.com&gt;</w:t>
-      </w:r>
-    </w:p>
-    <w:p>
-      <w:pPr>
-        <w:pStyle w:val="ListBullet"/>
-        <w:spacing w:after="60" w:before="0" w:line="276" w:lineRule="auto"/>
-        <w:ind w:left="720"/>
-      </w:pPr>
-      <w:r>
-        <w:rPr>
-          <w:i/>
-        </w:rPr>
-        <w:t>Ngày thực hiện:</w:t>
-      </w:r>
-      <w:r>
-        <w:t xml:space="preserve"> Mon Jun 8 13:41:48 2026 +0700</w:t>
-      </w:r>
-    </w:p>
-    <w:p>
-      <w:pPr>
-        <w:pStyle w:val="ListBullet"/>
-        <w:spacing w:after="60" w:before="0" w:line="276" w:lineRule="auto"/>
-        <w:ind w:left="720"/>
-      </w:pPr>
-      <w:r>
-        <w:rPr>
-          <w:i/>
-        </w:rPr>
-        <w:t>Tiêu đề:</w:t>
-      </w:r>
-      <w:r>
-        <w:t xml:space="preserve"> feat: implement per-camera partitioning for data, configurations, model weights, and scalers</w:t>
-      </w:r>
-    </w:p>
-    <w:p>
-      <w:pPr>
-        <w:pStyle w:val="ListBullet"/>
-        <w:spacing w:after="60" w:before="0" w:line="276" w:lineRule="auto"/>
-        <w:ind w:left="720"/>
-      </w:pPr>
-      <w:r>
-        <w:rPr>
-          <w:i/>
-        </w:rPr>
-        <w:t>Chi tiết:</w:t>
-      </w:r>
-      <w:r>
-        <w:t xml:space="preserve"> Thiết lập cơ chế đa camera (multi-camera partitioning) độc lập cho toàn bộ tài nguyên: file lịch sử CSV, file cấu hình, scaler và trọng số mô hình.</w:t>
-      </w:r>
-    </w:p>
-    <w:p>
-      <w:pPr>
-        <w:pStyle w:val="ListBullet"/>
-        <w:spacing w:after="60" w:before="0" w:line="276" w:lineRule="auto"/>
-        <w:ind w:left="360"/>
-      </w:pPr>
-      <w:r>
-        <w:rPr>
-          <w:b/>
-        </w:rPr>
-        <w:t>Commit Hash:</w:t>
-      </w:r>
-      <w:r>
-        <w:t xml:space="preserve"> </w:t>
-      </w:r>
-      <w:r>
-        <w:rPr>
-          <w:rFonts w:ascii="Courier New" w:hAnsi="Courier New"/>
-          <w:color w:val="B43232"/>
-          <w:sz w:val="19"/>
-        </w:rPr>
-        <w:t>9c68d66</w:t>
-      </w:r>
-    </w:p>
-    <w:p>
-      <w:pPr>
-        <w:pStyle w:val="ListBullet"/>
-        <w:spacing w:after="60" w:before="0" w:line="276" w:lineRule="auto"/>
-        <w:ind w:left="720"/>
-      </w:pPr>
-      <w:r>
-        <w:rPr>
-          <w:i/>
-        </w:rPr>
-        <w:t>Tác giả:</w:t>
-      </w:r>
-      <w:r>
-        <w:t xml:space="preserve"> admin-khai &lt;admin-khai@example.com&gt;</w:t>
-      </w:r>
-    </w:p>
-    <w:p>
-      <w:pPr>
-        <w:pStyle w:val="ListBullet"/>
-        <w:spacing w:after="60" w:before="0" w:line="276" w:lineRule="auto"/>
-        <w:ind w:left="720"/>
-      </w:pPr>
-      <w:r>
-        <w:rPr>
-          <w:i/>
-        </w:rPr>
-        <w:t>Ngày thực hiện:</w:t>
-      </w:r>
-      <w:r>
-        <w:t xml:space="preserve"> Mon Jun 8 08:39:40 2026 +0700</w:t>
-      </w:r>
-    </w:p>
-    <w:p>
-      <w:pPr>
-        <w:pStyle w:val="ListBullet"/>
-        <w:spacing w:after="60" w:before="0" w:line="276" w:lineRule="auto"/>
-        <w:ind w:left="720"/>
-      </w:pPr>
-      <w:r>
-        <w:rPr>
-          <w:i/>
-        </w:rPr>
-        <w:t>Tiêu đề:</w:t>
-      </w:r>
-      <w:r>
-        <w:t xml:space="preserve"> fix: resolve exploding predictions and add camera auto-reconnect</w:t>
-      </w:r>
-    </w:p>
-    <w:p>
-      <w:pPr>
-        <w:pStyle w:val="ListBullet"/>
-        <w:spacing w:after="60" w:before="0" w:line="276" w:lineRule="auto"/>
-        <w:ind w:left="720"/>
-      </w:pPr>
-      <w:r>
-        <w:rPr>
-          <w:i/>
-        </w:rPr>
-        <w:t>Chi tiết:</w:t>
-      </w:r>
-      <w:r>
-        <w:t xml:space="preserve"> Sửa lỗi bùng nổ giá trị dự báo nhiệt độ do khuyết dữ liệu thông qua bộ nội suy thời gian. Tích hợp tính năng tự động kết nối lại camera khi đứt luồng RTSP.</w:t>
-      </w:r>
-    </w:p>
-    <w:p>
-      <w:pPr>
-        <w:pStyle w:val="ListBullet"/>
-        <w:spacing w:after="60" w:before="0" w:line="276" w:lineRule="auto"/>
-        <w:ind w:left="360"/>
-      </w:pPr>
-      <w:r>
-        <w:rPr>
-          <w:b/>
-        </w:rPr>
-        <w:t>Commit Hash:</w:t>
-      </w:r>
-      <w:r>
-        <w:t xml:space="preserve"> </w:t>
-      </w:r>
-      <w:r>
-        <w:rPr>
-          <w:rFonts w:ascii="Courier New" w:hAnsi="Courier New"/>
-          <w:color w:val="B43232"/>
-          <w:sz w:val="19"/>
-        </w:rPr>
-        <w:t>5620f4c</w:t>
-      </w:r>
-    </w:p>
-    <w:p>
-      <w:pPr>
-        <w:pStyle w:val="ListBullet"/>
-        <w:spacing w:after="60" w:before="0" w:line="276" w:lineRule="auto"/>
-        <w:ind w:left="720"/>
-      </w:pPr>
-      <w:r>
-        <w:rPr>
-          <w:i/>
-        </w:rPr>
-        <w:t>Tác giả:</w:t>
-      </w:r>
-      <w:r>
-        <w:t xml:space="preserve"> admin-khai &lt;admin-khai@example.com&gt;</w:t>
-      </w:r>
-    </w:p>
-    <w:p>
-      <w:pPr>
-        <w:pStyle w:val="ListBullet"/>
-        <w:spacing w:after="60" w:before="0" w:line="276" w:lineRule="auto"/>
-        <w:ind w:left="720"/>
-      </w:pPr>
-      <w:r>
-        <w:rPr>
-          <w:i/>
-        </w:rPr>
-        <w:t>Ngày thực hiện:</w:t>
-      </w:r>
-      <w:r>
-        <w:t xml:space="preserve"> Thu Jun 4 13:37:12 2026 +0700</w:t>
-      </w:r>
-    </w:p>
-    <w:p>
-      <w:pPr>
-        <w:pStyle w:val="ListBullet"/>
-        <w:spacing w:after="60" w:before="0" w:line="276" w:lineRule="auto"/>
-        <w:ind w:left="720"/>
-      </w:pPr>
-      <w:r>
-        <w:rPr>
-          <w:i/>
-        </w:rPr>
-        <w:t>Tiêu đề:</w:t>
-      </w:r>
-      <w:r>
-        <w:t xml:space="preserve"> chore: update targets list configuration</w:t>
-      </w:r>
-    </w:p>
-    <w:p>
-      <w:pPr>
-        <w:pStyle w:val="ListBullet"/>
-        <w:spacing w:after="60" w:before="0" w:line="276" w:lineRule="auto"/>
-        <w:ind w:left="720"/>
-      </w:pPr>
-      <w:r>
-        <w:rPr>
-          <w:i/>
-        </w:rPr>
-        <w:t>Chi tiết:</w:t>
-      </w:r>
-      <w:r>
-        <w:t xml:space="preserve"> Cập nhật danh sách điểm đo nhiệt độ cần giám sát (</w:t>
-      </w:r>
-      <w:r>
-        <w:rPr>
-          <w:rFonts w:ascii="Courier New" w:hAnsi="Courier New"/>
-          <w:color w:val="B43232"/>
-          <w:sz w:val="19"/>
-        </w:rPr>
-        <w:t>targets</w:t>
-      </w:r>
-      <w:r>
-        <w:t>) cho các trạm biến áp.</w:t>
-      </w:r>
-    </w:p>
-    <w:p>
-      <w:pPr>
-        <w:pStyle w:val="ListBullet"/>
-        <w:spacing w:after="60" w:before="0" w:line="276" w:lineRule="auto"/>
-        <w:ind w:left="360"/>
-      </w:pPr>
-      <w:r>
-        <w:rPr>
-          <w:b/>
-        </w:rPr>
-        <w:t>Commit Hash:</w:t>
-      </w:r>
-      <w:r>
-        <w:t xml:space="preserve"> </w:t>
-      </w:r>
-      <w:r>
-        <w:rPr>
-          <w:rFonts w:ascii="Courier New" w:hAnsi="Courier New"/>
-          <w:color w:val="B43232"/>
-          <w:sz w:val="19"/>
-        </w:rPr>
-        <w:t>77dba7d</w:t>
-      </w:r>
-    </w:p>
-    <w:p>
-      <w:pPr>
-        <w:pStyle w:val="ListBullet"/>
-        <w:spacing w:after="60" w:before="0" w:line="276" w:lineRule="auto"/>
-        <w:ind w:left="720"/>
-      </w:pPr>
-      <w:r>
-        <w:rPr>
-          <w:i/>
-        </w:rPr>
-        <w:t>Tác giả:</w:t>
-      </w:r>
-      <w:r>
-        <w:t xml:space="preserve"> admin-khai &lt;admin-khai@example.com&gt;</w:t>
-      </w:r>
-    </w:p>
-    <w:p>
-      <w:pPr>
-        <w:pStyle w:val="ListBullet"/>
-        <w:spacing w:after="60" w:before="0" w:line="276" w:lineRule="auto"/>
-        <w:ind w:left="720"/>
-      </w:pPr>
-      <w:r>
-        <w:rPr>
-          <w:i/>
-        </w:rPr>
-        <w:t>Ngày thực hiện:</w:t>
-      </w:r>
-      <w:r>
-        <w:t xml:space="preserve"> Wed Jun 3 17:23:56 2026 +0700</w:t>
-      </w:r>
-    </w:p>
-    <w:p>
-      <w:pPr>
-        <w:pStyle w:val="ListBullet"/>
-        <w:spacing w:after="60" w:before="0" w:line="276" w:lineRule="auto"/>
-        <w:ind w:left="720"/>
-      </w:pPr>
-      <w:r>
-        <w:rPr>
-          <w:i/>
-        </w:rPr>
-        <w:t>Tiêu đề:</w:t>
-      </w:r>
-      <w:r>
-        <w:t xml:space="preserve"> feat: stabilize thermal monitoring pipeline and implement instant alerting</w:t>
-      </w:r>
-    </w:p>
-    <w:p>
-      <w:pPr>
-        <w:pStyle w:val="ListBullet"/>
-        <w:spacing w:after="60" w:before="0" w:line="276" w:lineRule="auto"/>
-        <w:ind w:left="720"/>
-      </w:pPr>
-      <w:r>
-        <w:rPr>
-          <w:i/>
-        </w:rPr>
-        <w:t>Chi tiết:</w:t>
-      </w:r>
-      <w:r>
-        <w:t xml:space="preserve"> Tối ưu hóa đường ống thu thập và dự báo nhiệt độ, tích hợp cảnh báo người xâm nhập tức thời với bộ khóa trạng thái chống spam. Xử lý gộp gói tin đo nhiệt độ từ camera gửi lên trong vòng 5 giây và ngăn chặn ghi dòng trống vào CSV khi targets rỗng.</w:t>
-      </w:r>
-    </w:p>
-    <w:p>
-      <w:pPr>
-        <w:pStyle w:val="ListBullet"/>
-        <w:spacing w:after="60" w:before="0" w:line="276" w:lineRule="auto"/>
-        <w:ind w:left="360"/>
-      </w:pPr>
-      <w:r>
-        <w:rPr>
-          <w:b/>
-        </w:rPr>
-        <w:t>Commit Hash:</w:t>
-      </w:r>
-      <w:r>
-        <w:t xml:space="preserve"> </w:t>
-      </w:r>
-      <w:r>
-        <w:rPr>
-          <w:rFonts w:ascii="Courier New" w:hAnsi="Courier New"/>
-          <w:color w:val="B43232"/>
-          <w:sz w:val="19"/>
-        </w:rPr>
-        <w:t>e27c6e1</w:t>
-      </w:r>
-    </w:p>
-    <w:p>
-      <w:pPr>
-        <w:pStyle w:val="ListBullet"/>
-        <w:spacing w:after="60" w:before="0" w:line="276" w:lineRule="auto"/>
-        <w:ind w:left="720"/>
-      </w:pPr>
-      <w:r>
-        <w:rPr>
-          <w:i/>
-        </w:rPr>
-        <w:t>Tác giả:</w:t>
-      </w:r>
-      <w:r>
-        <w:t xml:space="preserve"> admin-khai &lt;admin-khai@example.com&gt;</w:t>
-      </w:r>
-    </w:p>
-    <w:p>
-      <w:pPr>
-        <w:pStyle w:val="ListBullet"/>
-        <w:spacing w:after="60" w:before="0" w:line="276" w:lineRule="auto"/>
-        <w:ind w:left="720"/>
-      </w:pPr>
-      <w:r>
-        <w:rPr>
-          <w:i/>
-        </w:rPr>
-        <w:t>Ngày thực hiện:</w:t>
-      </w:r>
-      <w:r>
-        <w:t xml:space="preserve"> Tue Jun 2 17:02:39 2026 +0700</w:t>
-      </w:r>
-    </w:p>
-    <w:p>
-      <w:pPr>
-        <w:pStyle w:val="ListBullet"/>
-        <w:spacing w:after="60" w:before="0" w:line="276" w:lineRule="auto"/>
-        <w:ind w:left="720"/>
-      </w:pPr>
-      <w:r>
-        <w:rPr>
-          <w:i/>
-        </w:rPr>
-        <w:t>Tiêu đề:</w:t>
-      </w:r>
-      <w:r>
-        <w:t xml:space="preserve"> Stabilize thermal forecasting, non-destructive CSV dynamic schema sync, and YOLOv8 event-based person detection MP4 recording with anti-flicker hybrid alerts</w:t>
-      </w:r>
-    </w:p>
-    <w:p>
-      <w:pPr>
-        <w:pStyle w:val="ListBullet"/>
-        <w:spacing w:after="60" w:before="0" w:line="276" w:lineRule="auto"/>
-        <w:ind w:left="720"/>
-      </w:pPr>
-      <w:r>
-        <w:rPr>
-          <w:i/>
-        </w:rPr>
-        <w:t>Chi tiết:</w:t>
-      </w:r>
-      <w:r>
-        <w:t xml:space="preserve"> Bản cập nhật lớn ổn định tính năng dự báo nhiệt độ, cơ chế đồng bộ hóa schema CSV động không phá hủy cấu trúc cũ, ghi video sự kiện MP4 khi có người xâm nhập với bộ lọc chống rung giật.</w:t>
-      </w:r>
-    </w:p>
-    <w:p>
-      <w:pPr>
-        <w:pStyle w:val="ListBullet"/>
-        <w:spacing w:after="60" w:before="0" w:line="276" w:lineRule="auto"/>
-        <w:ind w:left="360"/>
-      </w:pPr>
-      <w:r>
-        <w:rPr>
-          <w:b/>
-        </w:rPr>
-        <w:t>Commit Hash:</w:t>
-      </w:r>
-      <w:r>
-        <w:t xml:space="preserve"> </w:t>
-      </w:r>
-      <w:r>
-        <w:rPr>
-          <w:rFonts w:ascii="Courier New" w:hAnsi="Courier New"/>
-          <w:color w:val="B43232"/>
-          <w:sz w:val="19"/>
-        </w:rPr>
-        <w:t>3378811</w:t>
-      </w:r>
-    </w:p>
-    <w:p>
-      <w:pPr>
-        <w:pStyle w:val="ListBullet"/>
-        <w:spacing w:after="60" w:before="0" w:line="276" w:lineRule="auto"/>
-        <w:ind w:left="720"/>
-      </w:pPr>
-      <w:r>
-        <w:rPr>
-          <w:i/>
-        </w:rPr>
-        <w:t>Tác giả:</w:t>
-      </w:r>
-      <w:r>
-        <w:t xml:space="preserve"> admin-khai &lt;admin-khai@example.com&gt;</w:t>
-      </w:r>
-    </w:p>
-    <w:p>
-      <w:pPr>
-        <w:pStyle w:val="ListBullet"/>
-        <w:spacing w:after="60" w:before="0" w:line="276" w:lineRule="auto"/>
-        <w:ind w:left="720"/>
-      </w:pPr>
-      <w:r>
-        <w:rPr>
-          <w:i/>
-        </w:rPr>
-        <w:t>Ngày thực hiện:</w:t>
-      </w:r>
-      <w:r>
-        <w:t xml:space="preserve"> Sat May 30 17:56:54 2026 +0700</w:t>
-      </w:r>
-    </w:p>
-    <w:p>
-      <w:pPr>
-        <w:pStyle w:val="ListBullet"/>
-        <w:spacing w:after="60" w:before="0" w:line="276" w:lineRule="auto"/>
-        <w:ind w:left="720"/>
-      </w:pPr>
-      <w:r>
-        <w:rPr>
-          <w:i/>
-        </w:rPr>
-        <w:t>Tiêu đề:</w:t>
-      </w:r>
-      <w:r>
-        <w:t xml:space="preserve"> Update central server IP, uncomment YOLOv8, and add edge system script files</w:t>
-      </w:r>
-    </w:p>
-    <w:p>
-      <w:pPr>
-        <w:pStyle w:val="ListBullet"/>
-        <w:spacing w:after="60" w:before="0" w:line="276" w:lineRule="auto"/>
-        <w:ind w:left="720"/>
-      </w:pPr>
-      <w:r>
-        <w:rPr>
-          <w:i/>
-        </w:rPr>
-        <w:t>Chi tiết:</w:t>
-      </w:r>
-      <w:r>
-        <w:t xml:space="preserve"> Cập nhật địa chỉ IP máy chủ trung tâm thành </w:t>
-      </w:r>
-      <w:r>
-        <w:rPr>
-          <w:rFonts w:ascii="Courier New" w:hAnsi="Courier New"/>
-          <w:color w:val="B43232"/>
-          <w:sz w:val="19"/>
-        </w:rPr>
-        <w:t>192.168.x.102</w:t>
-      </w:r>
-      <w:r>
-        <w:t>, kích hoạt chạy module YOLOv8 và bổ sung các file script điều hành biên (</w:t>
-      </w:r>
-      <w:r>
-        <w:rPr>
-          <w:rFonts w:ascii="Courier New" w:hAnsi="Courier New"/>
-          <w:color w:val="B43232"/>
-          <w:sz w:val="19"/>
-        </w:rPr>
-        <w:t>main_all.py</w:t>
-      </w:r>
-      <w:r>
-        <w:t xml:space="preserve">, </w:t>
-      </w:r>
-      <w:r>
-        <w:rPr>
-          <w:rFonts w:ascii="Courier New" w:hAnsi="Courier New"/>
-          <w:color w:val="B43232"/>
-          <w:sz w:val="19"/>
-        </w:rPr>
-        <w:t>yolo_detect.py</w:t>
-      </w:r>
-      <w:r>
-        <w:t xml:space="preserve">, </w:t>
-      </w:r>
-      <w:r>
-        <w:rPr>
-          <w:rFonts w:ascii="Courier New" w:hAnsi="Courier New"/>
-          <w:color w:val="B43232"/>
-          <w:sz w:val="19"/>
-        </w:rPr>
-        <w:t>thermal_sender.py</w:t>
-      </w:r>
-      <w:r>
-        <w:t>).</w:t>
-      </w:r>
-    </w:p>
-    <w:p>
-      <w:pPr>
-        <w:pStyle w:val="ListBullet"/>
-        <w:spacing w:after="60" w:before="0" w:line="276" w:lineRule="auto"/>
-        <w:ind w:left="360"/>
-      </w:pPr>
-      <w:r>
-        <w:rPr>
-          <w:b/>
-        </w:rPr>
-        <w:t>Commit Hash:</w:t>
-      </w:r>
-      <w:r>
-        <w:t xml:space="preserve"> </w:t>
-      </w:r>
-      <w:r>
-        <w:rPr>
-          <w:rFonts w:ascii="Courier New" w:hAnsi="Courier New"/>
-          <w:color w:val="B43232"/>
-          <w:sz w:val="19"/>
-        </w:rPr>
-        <w:t>db2c8c6</w:t>
-      </w:r>
-    </w:p>
-    <w:p>
-      <w:pPr>
-        <w:pStyle w:val="ListBullet"/>
-        <w:spacing w:after="60" w:before="0" w:line="276" w:lineRule="auto"/>
-        <w:ind w:left="720"/>
-      </w:pPr>
-      <w:r>
-        <w:rPr>
-          <w:i/>
-        </w:rPr>
-        <w:t>Tác giả:</w:t>
-      </w:r>
-      <w:r>
-        <w:t xml:space="preserve"> admin-khai &lt;admin-khai@example.com&gt;</w:t>
-      </w:r>
-    </w:p>
-    <w:p>
-      <w:pPr>
-        <w:pStyle w:val="ListBullet"/>
-        <w:spacing w:after="60" w:before="0" w:line="276" w:lineRule="auto"/>
-        <w:ind w:left="720"/>
-      </w:pPr>
-      <w:r>
-        <w:rPr>
-          <w:i/>
-        </w:rPr>
-        <w:t>Ngày thực hiện:</w:t>
-      </w:r>
-      <w:r>
-        <w:t xml:space="preserve"> Thu Apr 23 08:18:50 2026 +0700</w:t>
-      </w:r>
-    </w:p>
-    <w:p>
-      <w:pPr>
-        <w:pStyle w:val="ListBullet"/>
-        <w:spacing w:after="60" w:before="0" w:line="276" w:lineRule="auto"/>
-        <w:ind w:left="720"/>
-      </w:pPr>
-      <w:r>
-        <w:rPr>
-          <w:i/>
-        </w:rPr>
-        <w:t>Tiêu đề:</w:t>
-      </w:r>
-      <w:r>
-        <w:t xml:space="preserve"> Add .gitignore and remove pycache</w:t>
-      </w:r>
-    </w:p>
-    <w:p>
-      <w:pPr>
-        <w:pStyle w:val="ListBullet"/>
-        <w:spacing w:after="60" w:before="0" w:line="276" w:lineRule="auto"/>
-        <w:ind w:left="720"/>
-      </w:pPr>
-      <w:r>
-        <w:rPr>
-          <w:i/>
-        </w:rPr>
-        <w:t>Chi tiết:</w:t>
-      </w:r>
-      <w:r>
-        <w:t xml:space="preserve"> Thiết lập loại trừ file tạm, cache và các thư mục </w:t>
-      </w:r>
-      <w:r>
-        <w:rPr>
-          <w:rFonts w:ascii="Courier New" w:hAnsi="Courier New"/>
-          <w:color w:val="B43232"/>
-          <w:sz w:val="19"/>
-        </w:rPr>
-        <w:t>.pycache</w:t>
-      </w:r>
-      <w:r>
-        <w:t xml:space="preserve"> khỏi kho quản lý mã nguồn.</w:t>
-      </w:r>
-    </w:p>
-    <w:p>
-      <w:pPr>
-        <w:pStyle w:val="ListBullet"/>
-        <w:spacing w:after="60" w:before="0" w:line="276" w:lineRule="auto"/>
-        <w:ind w:left="360"/>
-      </w:pPr>
-      <w:r>
-        <w:rPr>
-          <w:b/>
-        </w:rPr>
-        <w:t>Commit Hash:</w:t>
-      </w:r>
-      <w:r>
-        <w:t xml:space="preserve"> </w:t>
-      </w:r>
-      <w:r>
-        <w:rPr>
-          <w:rFonts w:ascii="Courier New" w:hAnsi="Courier New"/>
-          <w:color w:val="B43232"/>
-          <w:sz w:val="19"/>
-        </w:rPr>
         <w:t>1d56434</w:t>
-      </w:r>
-    </w:p>
-    <w:p>
-      <w:pPr>
-        <w:pStyle w:val="ListBullet"/>
-        <w:spacing w:after="60" w:before="0" w:line="276" w:lineRule="auto"/>
-        <w:ind w:left="720"/>
-      </w:pPr>
-      <w:r>
-        <w:rPr>
-          <w:i/>
-        </w:rPr>
-        <w:t>Tác giả:</w:t>
-      </w:r>
-      <w:r>
-        <w:t xml:space="preserve"> admin-khai &lt;admin-khai@example.com&gt;</w:t>
       </w:r>
     </w:p>
     <w:p>

</xml_diff>